<commit_message>
Update CV print layout and restrict tech skills to project-specific ones
</commit_message>
<xml_diff>
--- a/Junho_Heo_CV.docx
+++ b/Junho_Heo_CV.docx
@@ -332,7 +332,7 @@
                                 <w:i/>
                                 <w:iCs/>
                               </w:rPr>
-                              <w:t>“Think relentlessly. Embrace challenges. Never give up.”</w:t>
+                              <w:t>“Finding structure in complex problems is an art.”</w:t>
                             </w:r>
                           </w:p>
                           <w:p/>
@@ -602,7 +602,7 @@
                           <w:i/>
                           <w:iCs/>
                         </w:rPr>
-                        <w:t>“Think relentlessly. Embrace challenges. Never give up.”</w:t>
+                        <w:t>“Finding structure in complex problems is an art.”</w:t>
                       </w:r>
                     </w:p>
                     <w:p/>
@@ -758,149 +758,52 @@
     </w:p>
     <w:p>
       <w:pPr>
+        <w:tabs>
+          <w:tab w:pos="9029" w:val="right"/>
+        </w:tabs>
         <w:rPr>
           <w:color w:val="7F7F7F" w:themeColor="text1" w:themeTint="80"/>
         </w:rPr>
       </w:pPr>
-      <w:r>
+      <w:r/>
+      <w:r>
+        <w:rPr/>
+        <w:t>Division of Computer Engineering (Software Major)</w:t>
+      </w:r>
+      <w:r>
+        <w:rPr/>
+        <w:tab/>
+      </w:r>
+      <w:r>
+        <w:rPr>
+          <w:b w:val="0"/>
+          <w:i/>
+          <w:color w:val="7F7F7F"/>
+          <w:sz w:val="18"/>
+        </w:rPr>
+        <w:t>March 2021 – February 2027 (Expected)</w:t>
+      </w:r>
+    </w:p>
+    <w:p>
+      <w:pPr>
+        <w:ind w:firstLineChars="100" w:firstLine="211"/>
         <w:rPr>
           <w:color w:val="7F7F7F" w:themeColor="text1" w:themeTint="80"/>
         </w:rPr>
-        <w:t xml:space="preserve">Division of Computer </w:t>
-      </w:r>
-      <w:proofErr w:type="gramStart"/>
-      <w:r>
-        <w:rPr>
-          <w:color w:val="7F7F7F" w:themeColor="text1" w:themeTint="80"/>
-        </w:rPr>
-        <w:t>Engineering(</w:t>
-      </w:r>
-      <w:proofErr w:type="gramEnd"/>
-      <w:r>
-        <w:rPr>
-          <w:color w:val="7F7F7F" w:themeColor="text1" w:themeTint="80"/>
-        </w:rPr>
-        <w:t xml:space="preserve">Software </w:t>
-      </w:r>
-      <w:r>
-        <w:rPr>
-          <w:color w:val="7F7F7F" w:themeColor="text1" w:themeTint="80"/>
-        </w:rPr>
-        <w:t>Major)</w:t>
-      </w:r>
-      <w:r>
-        <w:rPr>
-          <w:i/>
-          <w:iCs/>
-          <w:color w:val="7F7F7F" w:themeColor="text1" w:themeTint="80"/>
-        </w:rPr>
-        <w:tab/>
-      </w:r>
-      <w:r>
-        <w:rPr>
-          <w:i/>
-          <w:iCs/>
-          <w:color w:val="7F7F7F" w:themeColor="text1" w:themeTint="80"/>
-        </w:rPr>
-        <w:tab/>
-        <w:t xml:space="preserve">    </w:t>
-      </w:r>
-      <w:r>
-        <w:rPr>
-          <w:i/>
-          <w:iCs/>
-          <w:color w:val="7F7F7F" w:themeColor="text1" w:themeTint="80"/>
-          <w:sz w:val="18"/>
-          <w:szCs w:val="20"/>
-        </w:rPr>
-        <w:t>March 2021</w:t>
-      </w:r>
-      <w:r>
-        <w:rPr>
-          <w:rFonts w:hint="eastAsia"/>
-          <w:i/>
-          <w:iCs/>
-          <w:color w:val="7F7F7F" w:themeColor="text1" w:themeTint="80"/>
-          <w:sz w:val="18"/>
-          <w:szCs w:val="20"/>
-        </w:rPr>
-        <w:t xml:space="preserve"> </w:t>
-      </w:r>
-      <w:r>
-        <w:rPr>
-          <w:i/>
-          <w:iCs/>
-          <w:color w:val="7F7F7F" w:themeColor="text1" w:themeTint="80"/>
-          <w:sz w:val="18"/>
-          <w:szCs w:val="20"/>
-        </w:rPr>
-        <w:t>–</w:t>
-      </w:r>
-      <w:r>
-        <w:rPr>
-          <w:rFonts w:hint="eastAsia"/>
-          <w:i/>
-          <w:iCs/>
-          <w:color w:val="7F7F7F" w:themeColor="text1" w:themeTint="80"/>
-          <w:sz w:val="18"/>
-          <w:szCs w:val="20"/>
-        </w:rPr>
-        <w:t xml:space="preserve"> </w:t>
-      </w:r>
-      <w:r>
-        <w:rPr>
-          <w:i/>
-          <w:iCs/>
-          <w:color w:val="7F7F7F" w:themeColor="text1" w:themeTint="80"/>
-          <w:sz w:val="18"/>
-          <w:szCs w:val="20"/>
-        </w:rPr>
-        <w:t>February 2027 (Expected)</w:t>
-      </w:r>
-    </w:p>
-    <w:p>
-      <w:pPr>
-        <w:ind w:firstLineChars="100" w:firstLine="211"/>
-        <w:rPr>
-          <w:color w:val="7F7F7F" w:themeColor="text1" w:themeTint="80"/>
-        </w:rPr>
-      </w:pPr>
-      <w:r>
-        <w:rPr>
-          <w:color w:val="000000" w:themeColor="text1"/>
+      </w:pPr>
+      <w:r/>
+      <w:r>
+        <w:rPr>
+          <w:b w:val="0"/>
         </w:rPr>
         <w:t xml:space="preserve">• </w:t>
       </w:r>
       <w:r>
         <w:rPr>
-          <w:color w:val="7F7F7F" w:themeColor="text1" w:themeTint="80"/>
-        </w:rPr>
-        <w:t>Total GPA of 3.01/4.5</w:t>
-      </w:r>
-      <w:r>
-        <w:rPr>
-          <w:color w:val="7F7F7F" w:themeColor="text1" w:themeTint="80"/>
-        </w:rPr>
-        <w:t xml:space="preserve">, </w:t>
-      </w:r>
-      <w:r>
-        <w:rPr>
-          <w:color w:val="7F7F7F" w:themeColor="text1" w:themeTint="80"/>
-        </w:rPr>
-        <w:t xml:space="preserve">Major GPA 3.00 </w:t>
-      </w:r>
-      <w:r>
-        <w:rPr>
-          <w:rFonts w:hint="eastAsia"/>
-          <w:color w:val="7F7F7F" w:themeColor="text1" w:themeTint="80"/>
-        </w:rPr>
-        <w:t xml:space="preserve">/ </w:t>
-      </w:r>
-      <w:r>
-        <w:rPr>
-          <w:color w:val="7F7F7F" w:themeColor="text1" w:themeTint="80"/>
-        </w:rPr>
-        <w:t>4.5(Credits taken: 78.5/120)</w:t>
+          <w:b w:val="0"/>
+          <w:color w:val="000000"/>
+        </w:rPr>
+        <w:t>Total GPA of 2.99/4.5, Major GPA 3.24/4.5 (Credits taken: 97.5/120)</w:t>
       </w:r>
     </w:p>
     <w:p>
@@ -926,512 +829,217 @@
         <w:rPr>
           <w:rFonts w:ascii="IBM Plex Sans" w:hAnsi="IBM Plex Sans"/>
           <w:b/>
-          <w:bCs/>
-          <w:noProof/>
           <w:color w:val="86B37F"/>
           <w:sz w:val="36"/>
-          <w:szCs w:val="40"/>
-        </w:rPr>
-        <mc:AlternateContent>
-          <mc:Choice Requires="wps">
-            <w:drawing>
-              <wp:anchor distT="0" distB="0" distL="114300" distR="114300" simplePos="0" relativeHeight="251663360" behindDoc="0" locked="0" layoutInCell="1" allowOverlap="1" wp14:anchorId="2AA5F21A" wp14:editId="49EF1832">
-                <wp:simplePos x="0" y="0"/>
-                <wp:positionH relativeFrom="column">
-                  <wp:posOffset>2072428</wp:posOffset>
-                </wp:positionH>
-                <wp:positionV relativeFrom="paragraph">
-                  <wp:posOffset>241300</wp:posOffset>
-                </wp:positionV>
-                <wp:extent cx="3737509" cy="21683"/>
-                <wp:effectExtent l="0" t="0" r="22225" b="16510"/>
-                <wp:wrapNone/>
-                <wp:docPr id="801046681" name="직선 연결선[R] 3"/>
-                <wp:cNvGraphicFramePr/>
-                <a:graphic xmlns:a="http://schemas.openxmlformats.org/drawingml/2006/main">
-                  <a:graphicData uri="http://schemas.microsoft.com/office/word/2010/wordprocessingShape">
-                    <wps:wsp>
-                      <wps:cNvCnPr/>
-                      <wps:spPr>
-                        <a:xfrm>
-                          <a:off x="0" y="0"/>
-                          <a:ext cx="3737509" cy="21683"/>
-                        </a:xfrm>
-                        <a:prstGeom prst="line">
-                          <a:avLst/>
-                        </a:prstGeom>
-                        <a:ln w="15875">
-                          <a:solidFill>
-                            <a:schemeClr val="tx1">
-                              <a:lumMod val="65000"/>
-                              <a:lumOff val="35000"/>
-                            </a:schemeClr>
-                          </a:solidFill>
-                        </a:ln>
-                      </wps:spPr>
-                      <wps:style>
-                        <a:lnRef idx="1">
-                          <a:schemeClr val="accent1"/>
-                        </a:lnRef>
-                        <a:fillRef idx="0">
-                          <a:schemeClr val="accent1"/>
-                        </a:fillRef>
-                        <a:effectRef idx="0">
-                          <a:schemeClr val="accent1"/>
-                        </a:effectRef>
-                        <a:fontRef idx="minor">
-                          <a:schemeClr val="tx1"/>
-                        </a:fontRef>
-                      </wps:style>
-                      <wps:bodyPr/>
-                    </wps:wsp>
-                  </a:graphicData>
-                </a:graphic>
-                <wp14:sizeRelH relativeFrom="margin">
-                  <wp14:pctWidth>0</wp14:pctWidth>
-                </wp14:sizeRelH>
-                <wp14:sizeRelV relativeFrom="margin">
-                  <wp14:pctHeight>0</wp14:pctHeight>
-                </wp14:sizeRelV>
-              </wp:anchor>
-            </w:drawing>
-          </mc:Choice>
-          <mc:Fallback>
-            <w:pict>
-              <v:line w14:anchorId="5B9C8670" id="직선 연결선[R] 3" o:spid="_x0000_s1026" style="position:absolute;z-index:251663360;visibility:visible;mso-wrap-style:square;mso-width-percent:0;mso-height-percent:0;mso-wrap-distance-left:9pt;mso-wrap-distance-top:0;mso-wrap-distance-right:9pt;mso-wrap-distance-bottom:0;mso-position-horizontal:absolute;mso-position-horizontal-relative:text;mso-position-vertical:absolute;mso-position-vertical-relative:text;mso-width-percent:0;mso-height-percent:0;mso-width-relative:margin;mso-height-relative:margin" from="163.2pt,19pt" to="457.5pt,20.7pt" o:gfxdata="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" strokecolor="#5a5a5a [2109]" strokeweight="1.25pt">
-                <v:stroke joinstyle="miter"/>
-              </v:line>
-            </w:pict>
-          </mc:Fallback>
-        </mc:AlternateContent>
-      </w:r>
-      <w:r>
-        <w:rPr>
-          <w:rFonts w:ascii="IBM Plex Sans" w:hAnsi="IBM Plex Sans"/>
-          <w:b/>
-          <w:bCs/>
-          <w:color w:val="86B37F"/>
-          <w:sz w:val="36"/>
-          <w:szCs w:val="36"/>
-        </w:rPr>
-        <w:t>P</w:t>
-      </w:r>
-      <w:r>
-        <w:rPr>
-          <w:rFonts w:ascii="IBM Plex Sans" w:hAnsi="IBM Plex Sans"/>
-          <w:b/>
-          <w:bCs/>
-          <w:sz w:val="36"/>
-          <w:szCs w:val="36"/>
-        </w:rPr>
-        <w:t xml:space="preserve">roject </w:t>
-      </w:r>
-      <w:proofErr w:type="spellStart"/>
-      <w:r>
-        <w:rPr>
-          <w:rFonts w:ascii="IBM Plex Sans" w:hAnsi="IBM Plex Sans"/>
-          <w:b/>
-          <w:bCs/>
-          <w:color w:val="86B37F"/>
-          <w:sz w:val="36"/>
-          <w:szCs w:val="36"/>
-        </w:rPr>
-        <w:t>E</w:t>
-      </w:r>
-      <w:r>
-        <w:rPr>
-          <w:rFonts w:ascii="IBM Plex Sans" w:hAnsi="IBM Plex Sans"/>
-          <w:b/>
-          <w:bCs/>
-          <w:color w:val="86B37F"/>
-          <w:sz w:val="36"/>
-          <w:szCs w:val="36"/>
-        </w:rPr>
-        <w:t>xp</w:t>
-      </w:r>
-      <w:r>
-        <w:rPr>
-          <w:rFonts w:ascii="IBM Plex Sans" w:hAnsi="IBM Plex Sans"/>
-          <w:b/>
-          <w:bCs/>
-          <w:sz w:val="36"/>
-          <w:szCs w:val="36"/>
-        </w:rPr>
-        <w:t>reience</w:t>
-      </w:r>
-      <w:proofErr w:type="spellEnd"/>
-    </w:p>
-    <w:p>
-      <w:pPr>
-        <w:rPr>
-          <w:b/>
-          <w:bCs/>
-        </w:rPr>
-      </w:pPr>
-    </w:p>
-    <w:p>
-      <w:pPr>
-        <w:rPr>
-          <w:b/>
-          <w:bCs/>
-        </w:rPr>
-      </w:pPr>
-      <w:r>
-        <w:rPr>
-          <w:b/>
-          <w:bCs/>
-        </w:rPr>
-        <w:t>Seongnam City Bus Arrival Time Prediction</w:t>
-      </w:r>
-    </w:p>
-    <w:p>
-      <w:pPr>
-        <w:ind w:firstLineChars="100" w:firstLine="211"/>
-      </w:pPr>
-      <w:r>
+        </w:rPr>
+        <w:t>Project Experience</w:t>
+      </w:r>
+    </w:p>
+    <w:p/>
+    <w:p>
+      <w:r>
+        <w:rPr>
+          <w:rFonts w:ascii="IBM Plex Sans" w:hAnsi="IBM Plex Sans"/>
+          <w:sz w:val="20"/>
+        </w:rPr>
         <w:t xml:space="preserve">• </w:t>
       </w:r>
       <w:r>
         <w:rPr>
-          <w:color w:val="7F7F7F" w:themeColor="text1" w:themeTint="80"/>
-        </w:rPr>
-        <w:t xml:space="preserve">Developed a bus arrival time prediction model for Seongnam City (Bus #109) using an </w:t>
-      </w:r>
-      <w:proofErr w:type="spellStart"/>
-      <w:r>
-        <w:rPr>
-          <w:color w:val="7F7F7F" w:themeColor="text1" w:themeTint="80"/>
-        </w:rPr>
-        <w:t>XGBoost</w:t>
-      </w:r>
-      <w:proofErr w:type="spellEnd"/>
-      <w:r>
-        <w:rPr>
-          <w:color w:val="7F7F7F" w:themeColor="text1" w:themeTint="80"/>
-        </w:rPr>
-        <w:t xml:space="preserve"> </w:t>
-      </w:r>
-      <w:r>
-        <w:rPr>
-          <w:color w:val="7F7F7F" w:themeColor="text1" w:themeTint="80"/>
-        </w:rPr>
-        <w:t>algorithm.</w:t>
-      </w:r>
-    </w:p>
-    <w:p>
-      <w:pPr>
-        <w:ind w:firstLineChars="100" w:firstLine="211"/>
-        <w:rPr>
-          <w:color w:val="7F7F7F" w:themeColor="text1" w:themeTint="80"/>
-        </w:rPr>
-      </w:pPr>
-      <w:r>
+          <w:rFonts w:ascii="IBM Plex Sans" w:hAnsi="IBM Plex Sans"/>
+          <w:color w:val="7F7F7F"/>
+          <w:sz w:val="20"/>
+        </w:rPr>
+        <w:t>Developed a responsive personal portfolio website from scratch using HTML, CSS, and JavaScript.</w:t>
+      </w:r>
+    </w:p>
+    <w:p>
+      <w:r>
+        <w:rPr>
+          <w:rFonts w:ascii="IBM Plex Sans" w:hAnsi="IBM Plex Sans"/>
+          <w:b/>
+          <w:sz w:val="22"/>
+        </w:rPr>
+        <w:t>Personal Website Development (junho.art)</w:t>
+      </w:r>
+    </w:p>
+    <w:p>
+      <w:r>
+        <w:rPr>
+          <w:rFonts w:ascii="IBM Plex Sans" w:hAnsi="IBM Plex Sans"/>
+          <w:sz w:val="20"/>
+        </w:rPr>
         <w:t xml:space="preserve">• </w:t>
       </w:r>
       <w:r>
         <w:rPr>
-          <w:color w:val="7F7F7F" w:themeColor="text1" w:themeTint="80"/>
-        </w:rPr>
-        <w:t>The model utilized real-time traffic data, weather data, and historical bus time data for prediction.</w:t>
-      </w:r>
-    </w:p>
-    <w:p>
-      <w:pPr>
-        <w:ind w:firstLineChars="100" w:firstLine="211"/>
-        <w:rPr>
-          <w:color w:val="7F7F7F" w:themeColor="text1" w:themeTint="80"/>
-        </w:rPr>
-      </w:pPr>
-      <w:r>
-        <w:rPr>
-          <w:color w:val="000000" w:themeColor="text1"/>
+          <w:rFonts w:ascii="IBM Plex Sans" w:hAnsi="IBM Plex Sans"/>
+          <w:color w:val="7F7F7F"/>
+          <w:sz w:val="20"/>
+        </w:rPr>
+        <w:t>Designed background services and optimized data relaying processes.</w:t>
+      </w:r>
+    </w:p>
+    <w:p>
+      <w:r>
+        <w:rPr>
+          <w:rFonts w:ascii="IBM Plex Sans" w:hAnsi="IBM Plex Sans"/>
+          <w:sz w:val="20"/>
         </w:rPr>
         <w:t xml:space="preserve">• </w:t>
       </w:r>
       <w:r>
         <w:rPr>
-          <w:color w:val="7F7F7F" w:themeColor="text1" w:themeTint="80"/>
-        </w:rPr>
-        <w:t>Analyzed and visualized real-time traffic data with R to identify key road characteristics.</w:t>
-      </w:r>
-    </w:p>
-    <w:p>
-      <w:pPr>
-        <w:ind w:firstLineChars="100" w:firstLine="211"/>
-        <w:rPr>
-          <w:color w:val="7F7F7F" w:themeColor="text1" w:themeTint="80"/>
-        </w:rPr>
-      </w:pPr>
-      <w:r>
-        <w:rPr>
-          <w:color w:val="000000" w:themeColor="text1"/>
-        </w:rPr>
-        <w:t>•</w:t>
-      </w:r>
-      <w:r>
-        <w:rPr>
-          <w:color w:val="7F7F7F" w:themeColor="text1" w:themeTint="80"/>
-        </w:rPr>
-        <w:t xml:space="preserve"> </w:t>
-      </w:r>
-      <w:r>
-        <w:rPr>
-          <w:color w:val="7F7F7F" w:themeColor="text1" w:themeTint="80"/>
-        </w:rPr>
-        <w:t>Developing and implementing custom, reusable modules for required functionalities (e.g., data collection,</w:t>
-      </w:r>
-      <w:r>
-        <w:rPr>
-          <w:color w:val="7F7F7F" w:themeColor="text1" w:themeTint="80"/>
-        </w:rPr>
-        <w:t xml:space="preserve"> </w:t>
-      </w:r>
-    </w:p>
-    <w:p>
-      <w:pPr>
-        <w:ind w:firstLineChars="150" w:firstLine="317"/>
-        <w:rPr>
-          <w:color w:val="7F7F7F" w:themeColor="text1" w:themeTint="80"/>
-        </w:rPr>
-      </w:pPr>
-      <w:r>
-        <w:rPr>
-          <w:color w:val="7F7F7F" w:themeColor="text1" w:themeTint="80"/>
-        </w:rPr>
-        <w:t>preprocessing).</w:t>
-      </w:r>
-    </w:p>
-    <w:p>
-      <w:pPr>
-        <w:rPr>
-          <w:b/>
-          <w:bCs/>
-        </w:rPr>
-      </w:pPr>
-      <w:r>
-        <w:rPr>
-          <w:b/>
-          <w:bCs/>
-        </w:rPr>
-        <w:t>KakaoTalk Message Automation</w:t>
-      </w:r>
-    </w:p>
-    <w:p>
-      <w:pPr>
-        <w:ind w:firstLineChars="100" w:firstLine="211"/>
-        <w:rPr>
-          <w:color w:val="7F7F7F" w:themeColor="text1" w:themeTint="80"/>
-        </w:rPr>
-      </w:pPr>
-      <w:r>
+          <w:rFonts w:ascii="IBM Plex Sans" w:hAnsi="IBM Plex Sans"/>
+          <w:color w:val="7F7F7F"/>
+          <w:sz w:val="20"/>
+        </w:rPr>
+        <w:t>Developed an API server that processes notification data, and an Android APK broadcasting to KakaoTalk.</w:t>
+      </w:r>
+    </w:p>
+    <w:p>
+      <w:r>
+        <w:rPr>
+          <w:rFonts w:ascii="IBM Plex Sans" w:hAnsi="IBM Plex Sans"/>
+          <w:b/>
+          <w:sz w:val="22"/>
+        </w:rPr>
+        <w:t>Magnolia (Magnolia)</w:t>
+      </w:r>
+    </w:p>
+    <w:p>
+      <w:r>
+        <w:rPr>
+          <w:rFonts w:ascii="IBM Plex Sans" w:hAnsi="IBM Plex Sans"/>
+          <w:sz w:val="20"/>
+        </w:rPr>
         <w:t xml:space="preserve">• </w:t>
       </w:r>
       <w:r>
         <w:rPr>
-          <w:color w:val="7F7F7F" w:themeColor="text1" w:themeTint="80"/>
-        </w:rPr>
-        <w:t>Developed a Node.js</w:t>
-      </w:r>
-      <w:r>
-        <w:rPr>
-          <w:rFonts w:hint="eastAsia"/>
-          <w:color w:val="7F7F7F" w:themeColor="text1" w:themeTint="80"/>
-        </w:rPr>
-        <w:t>-</w:t>
-      </w:r>
-      <w:r>
-        <w:rPr>
-          <w:color w:val="7F7F7F" w:themeColor="text1" w:themeTint="80"/>
-        </w:rPr>
-        <w:t>based tool</w:t>
-      </w:r>
-      <w:r>
-        <w:rPr>
-          <w:color w:val="7F7F7F" w:themeColor="text1" w:themeTint="80"/>
-        </w:rPr>
-        <w:t xml:space="preserve"> to automate KakaoTalk messages using HTTP requests.</w:t>
-      </w:r>
-    </w:p>
-    <w:p>
-      <w:pPr>
-        <w:ind w:leftChars="50" w:left="106" w:firstLineChars="50" w:firstLine="106"/>
-        <w:rPr>
-          <w:color w:val="7F7F7F" w:themeColor="text1" w:themeTint="80"/>
-        </w:rPr>
-      </w:pPr>
-      <w:r>
-        <w:rPr>
-          <w:color w:val="000000" w:themeColor="text1"/>
-        </w:rPr>
-        <w:t>•</w:t>
-      </w:r>
-      <w:r>
-        <w:rPr>
-          <w:color w:val="7F7F7F" w:themeColor="text1" w:themeTint="80"/>
-        </w:rPr>
-        <w:t xml:space="preserve"> Currently re-architecting the project in Go and Rust to build new, modular libraries and expand </w:t>
-      </w:r>
-    </w:p>
-    <w:p>
-      <w:pPr>
-        <w:ind w:leftChars="50" w:left="106" w:firstLineChars="100" w:firstLine="211"/>
-      </w:pPr>
-      <w:r>
-        <w:rPr>
-          <w:color w:val="7F7F7F" w:themeColor="text1" w:themeTint="80"/>
-        </w:rPr>
-        <w:t>functionality.</w:t>
-      </w:r>
-    </w:p>
-    <w:p>
-      <w:pPr>
-        <w:rPr>
-          <w:b/>
-          <w:bCs/>
-        </w:rPr>
-      </w:pPr>
-      <w:r>
-        <w:rPr>
-          <w:b/>
-          <w:bCs/>
-        </w:rPr>
-        <w:t>University Website Code Analysis</w:t>
-      </w:r>
-    </w:p>
-    <w:p>
-      <w:pPr>
-        <w:ind w:leftChars="100" w:left="317" w:hangingChars="50" w:hanging="106"/>
-        <w:rPr>
-          <w:color w:val="7F7F7F" w:themeColor="text1" w:themeTint="80"/>
-        </w:rPr>
-      </w:pPr>
-      <w:r>
+          <w:rFonts w:ascii="IBM Plex Sans" w:hAnsi="IBM Plex Sans"/>
+          <w:color w:val="7F7F7F"/>
+          <w:sz w:val="20"/>
+        </w:rPr>
+        <w:t>Performed feature engineering and model evaluation to achieve high accuracy.</w:t>
+      </w:r>
+    </w:p>
+    <w:p>
+      <w:r>
+        <w:rPr>
+          <w:rFonts w:ascii="IBM Plex Sans" w:hAnsi="IBM Plex Sans"/>
+          <w:sz w:val="20"/>
+        </w:rPr>
         <w:t xml:space="preserve">• </w:t>
       </w:r>
       <w:r>
         <w:rPr>
-          <w:color w:val="7F7F7F" w:themeColor="text1" w:themeTint="80"/>
-        </w:rPr>
-        <w:t xml:space="preserve">Analyzed </w:t>
-      </w:r>
-      <w:r>
-        <w:rPr>
-          <w:color w:val="7F7F7F" w:themeColor="text1" w:themeTint="80"/>
-        </w:rPr>
-        <w:t xml:space="preserve">both </w:t>
-      </w:r>
-      <w:r>
-        <w:rPr>
-          <w:color w:val="7F7F7F" w:themeColor="text1" w:themeTint="80"/>
-        </w:rPr>
-        <w:t xml:space="preserve">the </w:t>
-      </w:r>
-      <w:r>
-        <w:rPr>
-          <w:color w:val="7F7F7F" w:themeColor="text1" w:themeTint="80"/>
-        </w:rPr>
-        <w:t>client-side (front-end) and server-side (back-end)</w:t>
-      </w:r>
-      <w:r>
-        <w:rPr>
-          <w:color w:val="7F7F7F" w:themeColor="text1" w:themeTint="80"/>
-        </w:rPr>
-        <w:t xml:space="preserve"> code and structure of a university</w:t>
-      </w:r>
-      <w:r>
-        <w:rPr>
-          <w:color w:val="7F7F7F" w:themeColor="text1" w:themeTint="80"/>
-        </w:rPr>
-        <w:t xml:space="preserve"> </w:t>
-      </w:r>
-    </w:p>
-    <w:p>
-      <w:pPr>
-        <w:ind w:leftChars="150" w:left="318" w:hanging="1"/>
-        <w:rPr>
-          <w:color w:val="7F7F7F" w:themeColor="text1" w:themeTint="80"/>
-        </w:rPr>
-      </w:pPr>
-      <w:r>
-        <w:rPr>
-          <w:color w:val="7F7F7F" w:themeColor="text1" w:themeTint="80"/>
-        </w:rPr>
-        <w:t>website using Chrome Developer Tools.</w:t>
-      </w:r>
-    </w:p>
-    <w:p>
-      <w:pPr>
-        <w:rPr>
-          <w:b/>
-          <w:bCs/>
-        </w:rPr>
-      </w:pPr>
-      <w:r>
-        <w:rPr>
-          <w:b/>
-          <w:bCs/>
-        </w:rPr>
-        <w:t>Personal Website Development</w:t>
-      </w:r>
-      <w:r>
-        <w:rPr>
-          <w:rFonts w:hint="eastAsia"/>
-          <w:b/>
-          <w:bCs/>
-        </w:rPr>
-        <w:t xml:space="preserve"> </w:t>
-      </w:r>
-    </w:p>
-    <w:p>
-      <w:pPr>
-        <w:ind w:firstLineChars="100" w:firstLine="211"/>
-        <w:rPr>
-          <w:color w:val="7F7F7F" w:themeColor="text1" w:themeTint="80"/>
-        </w:rPr>
-      </w:pPr>
-      <w:r>
+          <w:rFonts w:ascii="IBM Plex Sans" w:hAnsi="IBM Plex Sans"/>
+          <w:color w:val="7F7F7F"/>
+          <w:sz w:val="20"/>
+        </w:rPr>
+        <w:t>Implemented a bus arrival delay prediction model for Seongnam City Bus #109 using Multilayer Perceptron (MLP).</w:t>
+      </w:r>
+    </w:p>
+    <w:p>
+      <w:r>
+        <w:rPr>
+          <w:rFonts w:ascii="IBM Plex Sans" w:hAnsi="IBM Plex Sans"/>
+          <w:b/>
+          <w:sz w:val="22"/>
+        </w:rPr>
+        <w:t>Bus Delay Prediction Model (sobdm-project)</w:t>
+      </w:r>
+    </w:p>
+    <w:p>
+      <w:r>
+        <w:rPr>
+          <w:rFonts w:ascii="IBM Plex Sans" w:hAnsi="IBM Plex Sans"/>
+          <w:sz w:val="20"/>
+        </w:rPr>
         <w:t xml:space="preserve">• </w:t>
       </w:r>
       <w:r>
         <w:rPr>
-          <w:color w:val="7F7F7F" w:themeColor="text1" w:themeTint="80"/>
-        </w:rPr>
-        <w:t>Developed a personal website from scratch using HTML, CSS, and JavaScript.</w:t>
-      </w:r>
-    </w:p>
-    <w:p>
-      <w:pPr>
-        <w:rPr>
-          <w:b/>
-          <w:bCs/>
-          <w:color w:val="7F7F7F" w:themeColor="text1" w:themeTint="80"/>
-          <w:sz w:val="36"/>
-          <w:szCs w:val="36"/>
-        </w:rPr>
-      </w:pPr>
-    </w:p>
-    <w:p>
-      <w:pPr>
-        <w:rPr>
-          <w:b/>
-          <w:bCs/>
-          <w:color w:val="7F7F7F" w:themeColor="text1" w:themeTint="80"/>
-          <w:sz w:val="36"/>
-          <w:szCs w:val="36"/>
-        </w:rPr>
-      </w:pPr>
-    </w:p>
-    <w:p>
-      <w:pPr>
-        <w:rPr>
-          <w:b/>
-          <w:bCs/>
-          <w:color w:val="7F7F7F" w:themeColor="text1" w:themeTint="80"/>
-          <w:sz w:val="36"/>
-          <w:szCs w:val="36"/>
-        </w:rPr>
-      </w:pPr>
-    </w:p>
+          <w:rFonts w:ascii="IBM Plex Sans" w:hAnsi="IBM Plex Sans"/>
+          <w:color w:val="7F7F7F"/>
+          <w:sz w:val="20"/>
+        </w:rPr>
+        <w:t>Experienced preprocessing chemical representation data and training deep learning models.</w:t>
+      </w:r>
+    </w:p>
+    <w:p>
+      <w:r>
+        <w:rPr>
+          <w:rFonts w:ascii="IBM Plex Sans" w:hAnsi="IBM Plex Sans"/>
+          <w:sz w:val="20"/>
+        </w:rPr>
+        <w:t xml:space="preserve">• </w:t>
+      </w:r>
+      <w:r>
+        <w:rPr>
+          <w:rFonts w:ascii="IBM Plex Sans" w:hAnsi="IBM Plex Sans"/>
+          <w:color w:val="7F7F7F"/>
+          <w:sz w:val="20"/>
+        </w:rPr>
+        <w:t>Built a Convolutional Neural Network (CNN) model for predicting drug–drug interactions.</w:t>
+      </w:r>
+    </w:p>
+    <w:p>
+      <w:r>
+        <w:rPr>
+          <w:rFonts w:ascii="IBM Plex Sans" w:hAnsi="IBM Plex Sans"/>
+          <w:b/>
+          <w:sz w:val="22"/>
+        </w:rPr>
+        <w:t>Drug–Drug Interaction Detection (ConvDDI)</w:t>
+      </w:r>
+    </w:p>
+    <w:p>
+      <w:r>
+        <w:rPr>
+          <w:rFonts w:ascii="IBM Plex Sans" w:hAnsi="IBM Plex Sans"/>
+          <w:sz w:val="20"/>
+        </w:rPr>
+        <w:t xml:space="preserve">• </w:t>
+      </w:r>
+      <w:r>
+        <w:rPr>
+          <w:rFonts w:ascii="IBM Plex Sans" w:hAnsi="IBM Plex Sans"/>
+          <w:color w:val="7F7F7F"/>
+          <w:sz w:val="20"/>
+        </w:rPr>
+        <w:t>Optimized data processing and pipeline design for structured academic paper data.</w:t>
+      </w:r>
+    </w:p>
+    <w:p>
+      <w:r>
+        <w:rPr>
+          <w:rFonts w:ascii="IBM Plex Sans" w:hAnsi="IBM Plex Sans"/>
+          <w:sz w:val="20"/>
+        </w:rPr>
+        <w:t xml:space="preserve">• </w:t>
+      </w:r>
+      <w:r>
+        <w:rPr>
+          <w:rFonts w:ascii="IBM Plex Sans" w:hAnsi="IBM Plex Sans"/>
+          <w:color w:val="7F7F7F"/>
+          <w:sz w:val="20"/>
+        </w:rPr>
+        <w:t>Developed an arXiv paper trend prediction system utilizing PCA and machine learning classifiers.</w:t>
+      </w:r>
+    </w:p>
+    <w:p>
+      <w:r>
+        <w:rPr>
+          <w:rFonts w:ascii="IBM Plex Sans" w:hAnsi="IBM Plex Sans"/>
+          <w:b/>
+          <w:sz w:val="22"/>
+        </w:rPr>
+        <w:t>TrendXiv (TrendXiv)</w:t>
+      </w:r>
+    </w:p>
+    <w:p/>
     <w:p>
       <w:pPr>
         <w:rPr>
@@ -1710,360 +1318,144 @@
     </w:p>
     <w:p>
       <w:pPr>
+        <w:tabs>
+          <w:tab w:pos="9029" w:val="right"/>
+        </w:tabs>
         <w:ind w:firstLine="211"/>
       </w:pPr>
-      <w:r>
-        <w:rPr>
-          <w:color w:val="7F7F7F"/>
-        </w:rPr>
-        <w:t xml:space="preserve">Spring </w:t>
-      </w:r>
-      <w:r>
-        <w:rPr>
-          <w:color w:val="7F7F7F"/>
-        </w:rPr>
-        <w:t>2026</w:t>
+      <w:r/>
+      <w:r>
+        <w:rPr>
+          <w:b w:val="0"/>
+        </w:rPr>
+        <w:t xml:space="preserve">Spring 2026  </w:t>
+      </w:r>
+      <w:r>
+        <w:rPr>
+          <w:b/>
+        </w:rPr>
+        <w:t>Faculty Recommendation Scholarship</w:t>
       </w:r>
       <w:r>
         <w:rPr/>
-        <w:t xml:space="preserve">  </w:t>
-      </w:r>
-      <w:r>
-        <w:rPr>
-          <w:b/>
-        </w:rPr>
-        <w:t>Faculty</w:t>
-      </w:r>
-      <w:r>
-        <w:rPr>
-          <w:b/>
-        </w:rPr>
-        <w:t xml:space="preserve"> Recommendation Scholarship</w:t>
-      </w:r>
-      <w:r>
-        <w:rPr>
+        <w:tab/>
+      </w:r>
+      <w:r>
+        <w:rPr>
+          <w:b w:val="0"/>
           <w:i/>
           <w:color w:val="86B37F"/>
         </w:rPr>
+        <w:t>Baekseok Univ.</w:t>
+      </w:r>
+    </w:p>
+    <w:p>
+      <w:pPr>
+        <w:tabs>
+          <w:tab w:pos="9029" w:val="right"/>
+        </w:tabs>
+        <w:ind w:firstLine="211"/>
+      </w:pPr>
+      <w:r/>
+      <w:r>
+        <w:rPr>
+          <w:b w:val="0"/>
+        </w:rPr>
+        <w:t xml:space="preserve">Fall 2025  </w:t>
+      </w:r>
+      <w:r>
+        <w:rPr>
+          <w:b/>
+        </w:rPr>
+        <w:t>Faculty Recommendation Scholarship [Repayment]</w:t>
+      </w:r>
+      <w:r>
+        <w:rPr/>
         <w:tab/>
       </w:r>
       <w:r>
         <w:rPr>
+          <w:b w:val="0"/>
           <w:i/>
           <w:color w:val="86B37F"/>
         </w:rPr>
+        <w:t>Baekseok Univ.</w:t>
+      </w:r>
+    </w:p>
+    <w:p>
+      <w:pPr>
+        <w:tabs>
+          <w:tab w:pos="9029" w:val="right"/>
+        </w:tabs>
+        <w:ind w:firstLineChars="100" w:firstLine="211"/>
+        <w:rPr>
+          <w:b/>
+          <w:bCs/>
+          <w:color w:val="7F7F7F" w:themeColor="text1" w:themeTint="80"/>
+        </w:rPr>
+      </w:pPr>
+      <w:r/>
+      <w:r>
+        <w:rPr>
+          <w:b w:val="0"/>
+        </w:rPr>
+        <w:t xml:space="preserve">Spring 2024  </w:t>
+      </w:r>
+      <w:r>
+        <w:rPr>
+          <w:b/>
+        </w:rPr>
+        <w:t>Faculty Recommendation Scholarship</w:t>
+      </w:r>
+      <w:r>
+        <w:rPr/>
         <w:tab/>
       </w:r>
       <w:r>
         <w:rPr>
+          <w:b w:val="0"/>
           <w:i/>
           <w:color w:val="86B37F"/>
         </w:rPr>
+        <w:t>Baekseok Univ.</w:t>
+      </w:r>
+    </w:p>
+    <w:p>
+      <w:pPr>
+        <w:tabs>
+          <w:tab w:pos="9029" w:val="right"/>
+        </w:tabs>
+        <w:ind w:firstLineChars="100" w:firstLine="211"/>
+        <w:rPr>
+          <w:b/>
+          <w:bCs/>
+          <w:color w:val="7F7F7F" w:themeColor="text1" w:themeTint="80"/>
+        </w:rPr>
+      </w:pPr>
+      <w:r/>
+      <w:r>
+        <w:rPr>
+          <w:b w:val="0"/>
+        </w:rPr>
+        <w:t xml:space="preserve">Spring 2021  </w:t>
+      </w:r>
+      <w:r>
+        <w:rPr>
+          <w:b/>
+        </w:rPr>
+        <w:t>National Scholarship (Type II)</w:t>
+      </w:r>
+      <w:r>
+        <w:rPr/>
         <w:tab/>
       </w:r>
       <w:r>
         <w:rPr>
+          <w:b w:val="0"/>
           <w:i/>
           <w:color w:val="86B37F"/>
         </w:rPr>
-        <w:tab/>
-        <w:t xml:space="preserve">    </w:t>
-      </w:r>
-      <w:r>
-        <w:rPr>
-          <w:i/>
-          <w:color w:val="86B37F"/>
-        </w:rPr>
-        <w:t>Baekseok</w:t>
-      </w:r>
-      <w:r>
-        <w:rPr>
-          <w:i/>
-          <w:color w:val="86B37F"/>
-        </w:rPr>
-        <w:t xml:space="preserve"> Uni</w:t>
-      </w:r>
-      <w:r>
-        <w:rPr>
-          <w:i/>
-          <w:color w:val="86B37F"/>
-        </w:rPr>
-        <w:t>v.</w:t>
-      </w:r>
-    </w:p>
-    <w:p>
-      <w:pPr>
-        <w:ind w:firstLine="211"/>
-      </w:pPr>
-      <w:r>
-        <w:rPr>
-          <w:color w:val="7F7F7F"/>
-        </w:rPr>
-        <w:t xml:space="preserve">Fall </w:t>
-      </w:r>
-      <w:r>
-        <w:rPr>
-          <w:color w:val="7F7F7F"/>
-        </w:rPr>
-        <w:t>2025</w:t>
-      </w:r>
-      <w:r>
-        <w:rPr/>
-        <w:t xml:space="preserve">  </w:t>
-      </w:r>
-      <w:r>
-        <w:rPr>
-          <w:b/>
-        </w:rPr>
-        <w:t>Faculty</w:t>
-      </w:r>
-      <w:r>
-        <w:rPr>
-          <w:b/>
-        </w:rPr>
-        <w:t xml:space="preserve"> Recommendation Scholarship [Repayment]</w:t>
-      </w:r>
-      <w:r>
-        <w:rPr>
-          <w:i/>
-          <w:color w:val="86B37F"/>
-        </w:rPr>
-        <w:tab/>
-      </w:r>
-      <w:r>
-        <w:rPr>
-          <w:i/>
-          <w:color w:val="86B37F"/>
-        </w:rPr>
-        <w:tab/>
-      </w:r>
-      <w:r>
-        <w:rPr>
-          <w:i/>
-          <w:color w:val="86B37F"/>
-        </w:rPr>
-        <w:tab/>
-      </w:r>
-      <w:r>
-        <w:rPr>
-          <w:i/>
-          <w:color w:val="86B37F"/>
-        </w:rPr>
-        <w:tab/>
-        <w:t xml:space="preserve">    </w:t>
-      </w:r>
-      <w:r>
-        <w:rPr>
-          <w:i/>
-          <w:color w:val="86B37F"/>
-        </w:rPr>
-        <w:t>Baekseok</w:t>
-      </w:r>
-      <w:r>
-        <w:rPr>
-          <w:i/>
-          <w:color w:val="86B37F"/>
-        </w:rPr>
-        <w:t xml:space="preserve"> Uni</w:t>
-      </w:r>
-      <w:r>
-        <w:rPr>
-          <w:i/>
-          <w:color w:val="86B37F"/>
-        </w:rPr>
-        <w:t>v.</w:t>
-      </w:r>
-    </w:p>
-    <w:p>
-      <w:pPr>
-        <w:ind w:firstLineChars="100" w:firstLine="211"/>
-        <w:rPr>
-          <w:b/>
-          <w:bCs/>
-          <w:color w:val="7F7F7F" w:themeColor="text1" w:themeTint="80"/>
-        </w:rPr>
-      </w:pPr>
-      <w:r>
-        <w:rPr>
-          <w:color w:val="7F7F7F" w:themeColor="text1" w:themeTint="80"/>
-        </w:rPr>
-        <w:t xml:space="preserve">Spring </w:t>
-      </w:r>
-      <w:proofErr w:type="gramStart"/>
-      <w:r>
-        <w:rPr>
-          <w:color w:val="7F7F7F" w:themeColor="text1" w:themeTint="80"/>
-        </w:rPr>
-        <w:t>2024</w:t>
-      </w:r>
-      <w:r>
-        <w:t xml:space="preserve">  </w:t>
-      </w:r>
-      <w:r>
-        <w:rPr>
-          <w:b/>
-          <w:bCs/>
-        </w:rPr>
-        <w:t>Faculty</w:t>
-      </w:r>
-      <w:proofErr w:type="gramEnd"/>
-      <w:r>
-        <w:rPr>
-          <w:b/>
-          <w:bCs/>
-        </w:rPr>
-        <w:t xml:space="preserve"> Recommendation Scholarship</w:t>
-      </w:r>
-      <w:r>
-        <w:rPr>
-          <w:i/>
-          <w:iCs/>
-          <w:color w:val="86B37F"/>
-        </w:rPr>
-        <w:tab/>
-      </w:r>
-      <w:r>
-        <w:rPr>
-          <w:i/>
-          <w:iCs/>
-          <w:color w:val="86B37F"/>
-        </w:rPr>
-        <w:tab/>
-      </w:r>
-      <w:r>
-        <w:rPr>
-          <w:i/>
-          <w:iCs/>
-          <w:color w:val="86B37F"/>
-        </w:rPr>
-        <w:tab/>
-      </w:r>
-      <w:r>
-        <w:rPr>
-          <w:i/>
-          <w:iCs/>
-          <w:color w:val="86B37F"/>
-        </w:rPr>
-        <w:tab/>
-        <w:t xml:space="preserve">    </w:t>
-      </w:r>
-      <w:proofErr w:type="spellStart"/>
-      <w:r>
-        <w:rPr>
-          <w:i/>
-          <w:iCs/>
-          <w:color w:val="86B37F"/>
-        </w:rPr>
-        <w:t>Baekseok</w:t>
-      </w:r>
-      <w:proofErr w:type="spellEnd"/>
-      <w:r>
-        <w:rPr>
-          <w:i/>
-          <w:iCs/>
-          <w:color w:val="86B37F"/>
-        </w:rPr>
-        <w:t xml:space="preserve"> Uni</w:t>
-      </w:r>
-      <w:r>
-        <w:rPr>
-          <w:i/>
-          <w:iCs/>
-          <w:color w:val="86B37F"/>
-        </w:rPr>
-        <w:t>v.</w:t>
-      </w:r>
-    </w:p>
-    <w:p>
-      <w:pPr>
-        <w:ind w:firstLineChars="100" w:firstLine="211"/>
-        <w:rPr>
-          <w:b/>
-          <w:bCs/>
-          <w:color w:val="7F7F7F" w:themeColor="text1" w:themeTint="80"/>
-        </w:rPr>
-      </w:pPr>
-      <w:r>
-        <w:rPr>
-          <w:color w:val="7F7F7F" w:themeColor="text1" w:themeTint="80"/>
-        </w:rPr>
-        <w:t xml:space="preserve">Spring </w:t>
-      </w:r>
-      <w:proofErr w:type="gramStart"/>
-      <w:r>
-        <w:rPr>
-          <w:color w:val="7F7F7F" w:themeColor="text1" w:themeTint="80"/>
-        </w:rPr>
-        <w:t>2021</w:t>
-      </w:r>
-      <w:r>
-        <w:t xml:space="preserve">  </w:t>
-      </w:r>
-      <w:r>
-        <w:rPr>
-          <w:b/>
-          <w:bCs/>
-        </w:rPr>
-        <w:t>National</w:t>
-      </w:r>
-      <w:proofErr w:type="gramEnd"/>
-      <w:r>
-        <w:rPr>
-          <w:b/>
-          <w:bCs/>
-        </w:rPr>
-        <w:t xml:space="preserve"> Scholarship (Type II)</w:t>
-      </w:r>
-      <w:r>
-        <w:rPr>
-          <w:i/>
-          <w:iCs/>
-          <w:color w:val="86B37F"/>
-        </w:rPr>
-        <w:tab/>
-      </w:r>
-      <w:r>
-        <w:rPr>
-          <w:i/>
-          <w:iCs/>
-          <w:color w:val="86B37F"/>
-        </w:rPr>
-        <w:tab/>
-      </w:r>
-      <w:r>
-        <w:rPr>
-          <w:i/>
-          <w:iCs/>
-          <w:color w:val="86B37F"/>
-        </w:rPr>
-        <w:tab/>
-      </w:r>
-      <w:r>
-        <w:rPr>
-          <w:i/>
-          <w:iCs/>
-          <w:color w:val="86B37F"/>
-        </w:rPr>
-        <w:tab/>
-        <w:t xml:space="preserve">    </w:t>
-      </w:r>
-      <w:proofErr w:type="spellStart"/>
-      <w:r>
-        <w:rPr>
-          <w:i/>
-          <w:iCs/>
-          <w:color w:val="86B37F"/>
-        </w:rPr>
-        <w:t>Baekseok</w:t>
-      </w:r>
-      <w:proofErr w:type="spellEnd"/>
-      <w:r>
-        <w:rPr>
-          <w:i/>
-          <w:iCs/>
-          <w:color w:val="86B37F"/>
-        </w:rPr>
-        <w:t xml:space="preserve"> Univ.</w:t>
+        <w:t>Baekseok Univ.</w:t>
       </w:r>
     </w:p>
     <w:p>
@@ -2460,78 +1852,78 @@
           <w:szCs w:val="20"/>
         </w:rPr>
       </w:pPr>
-      <w:r>
-        <w:rPr>
-          <w:rFonts w:cs="Times New Roman"/>
-          <w:b/>
-          <w:bCs/>
-          <w:color w:val="000000" w:themeColor="text1"/>
-          <w:szCs w:val="20"/>
-        </w:rPr>
-        <w:t>Programming</w:t>
-      </w:r>
-      <w:r>
-        <w:rPr>
-          <w:rFonts w:cs="Times New Roman"/>
-          <w:b/>
-          <w:bCs/>
-          <w:color w:val="000000" w:themeColor="text1"/>
-          <w:szCs w:val="20"/>
-        </w:rPr>
-        <w:t xml:space="preserve"> </w:t>
-      </w:r>
-      <w:r>
-        <w:rPr>
-          <w:rFonts w:cs="Times New Roman"/>
-          <w:color w:val="000000" w:themeColor="text1"/>
-          <w:szCs w:val="20"/>
-        </w:rPr>
-        <w:t xml:space="preserve">     </w:t>
-      </w:r>
-      <w:r>
+      <w:r/>
+      <w:r>
+        <w:rPr>
+          <w:rFonts w:ascii="IBM Plex Sans" w:hAnsi="IBM Plex Sans"/>
+          <w:b/>
+          <w:sz w:val="20"/>
+        </w:rPr>
+        <w:t xml:space="preserve">Programming      </w:t>
+      </w:r>
+      <w:r>
+        <w:rPr>
+          <w:rFonts w:ascii="IBM Plex Sans" w:hAnsi="IBM Plex Sans"/>
+          <w:color w:val="7F7F7F"/>
+          <w:sz w:val="20"/>
+        </w:rPr>
+        <w:t>Python, Rust, Kotlin, Java, JavaScript, HTML/CSS</w:t>
+      </w:r>
+    </w:p>
+    <w:p>
+      <w:pPr>
         <w:rPr>
           <w:rFonts w:cs="Times New Roman"/>
           <w:color w:val="7F7F7F" w:themeColor="text1" w:themeTint="80"/>
           <w:szCs w:val="20"/>
         </w:rPr>
-        <w:t>Python, C++, Rust, Go, Java, Kotlin, R, JavaScript, TypeScript</w:t>
-      </w:r>
-      <w:r>
+      </w:pPr>
+      <w:r/>
+      <w:r>
+        <w:rPr>
+          <w:rFonts w:ascii="IBM Plex Sans" w:hAnsi="IBM Plex Sans"/>
+          <w:b/>
+          <w:sz w:val="20"/>
+        </w:rPr>
+        <w:t xml:space="preserve">Machine Learning  </w:t>
+      </w:r>
+      <w:r>
+        <w:rPr>
+          <w:rFonts w:ascii="IBM Plex Sans" w:hAnsi="IBM Plex Sans"/>
+          <w:color w:val="7F7F7F"/>
+          <w:sz w:val="20"/>
+        </w:rPr>
+        <w:t>Scikit-learn</w:t>
+      </w:r>
+    </w:p>
+    <w:p>
+      <w:pPr>
         <w:rPr>
           <w:rFonts w:cs="Times New Roman"/>
           <w:color w:val="7F7F7F" w:themeColor="text1" w:themeTint="80"/>
           <w:szCs w:val="20"/>
         </w:rPr>
-        <w:t xml:space="preserve">, </w:t>
-      </w:r>
-      <w:proofErr w:type="spellStart"/>
-      <w:r>
-        <w:rPr>
-          <w:rFonts w:cs="Times New Roman"/>
-          <w:color w:val="7F7F7F" w:themeColor="text1" w:themeTint="80"/>
-          <w:szCs w:val="20"/>
-        </w:rPr>
-        <w:t>p</w:t>
-      </w:r>
-      <w:r>
-        <w:rPr>
-          <w:rFonts w:cs="Times New Roman"/>
-          <w:color w:val="7F7F7F" w:themeColor="text1" w:themeTint="80"/>
-          <w:szCs w:val="20"/>
-        </w:rPr>
-        <w:t>hp</w:t>
-      </w:r>
-      <w:proofErr w:type="spellEnd"/>
-    </w:p>
-    <w:p>
-      <w:pPr>
-        <w:rPr>
-          <w:rFonts w:cs="Times New Roman"/>
-          <w:color w:val="7F7F7F" w:themeColor="text1" w:themeTint="80"/>
-          <w:szCs w:val="20"/>
-        </w:rPr>
-      </w:pPr>
-      <w:r>
+      </w:pPr>
+      <w:r/>
+      <w:r>
+        <w:rPr>
+          <w:rFonts w:ascii="IBM Plex Sans" w:hAnsi="IBM Plex Sans"/>
+          <w:b/>
+          <w:sz w:val="20"/>
+        </w:rPr>
+        <w:t xml:space="preserve">Deep Learning     </w:t>
+      </w:r>
+      <w:r>
+        <w:rPr>
+          <w:rFonts w:ascii="IBM Plex Sans" w:hAnsi="IBM Plex Sans"/>
+          <w:color w:val="7F7F7F"/>
+          <w:sz w:val="20"/>
+        </w:rPr>
+        <w:t>PyTorch</w:t>
+      </w:r>
+    </w:p>
+    <w:p>
+      <w:pPr>
         <w:rPr>
           <w:rFonts w:cs="Times New Roman"/>
           <w:b/>
@@ -2539,165 +1931,23 @@
           <w:color w:val="000000" w:themeColor="text1"/>
           <w:szCs w:val="20"/>
         </w:rPr>
-        <w:t>Machine Learning</w:t>
-      </w:r>
-      <w:r>
-        <w:rPr>
-          <w:rFonts w:cs="Times New Roman"/>
-          <w:b/>
-          <w:bCs/>
-          <w:color w:val="000000" w:themeColor="text1"/>
-          <w:szCs w:val="20"/>
-        </w:rPr>
-        <w:t xml:space="preserve">  </w:t>
-      </w:r>
-      <w:proofErr w:type="spellStart"/>
-      <w:r>
-        <w:rPr>
-          <w:rFonts w:cs="Times New Roman"/>
-          <w:color w:val="7F7F7F" w:themeColor="text1" w:themeTint="80"/>
-          <w:szCs w:val="20"/>
-        </w:rPr>
-        <w:t>Skicit</w:t>
-      </w:r>
-      <w:proofErr w:type="spellEnd"/>
-      <w:r>
-        <w:rPr>
-          <w:rFonts w:cs="Times New Roman"/>
-          <w:color w:val="7F7F7F" w:themeColor="text1" w:themeTint="80"/>
-          <w:szCs w:val="20"/>
-        </w:rPr>
-        <w:t>-learn</w:t>
-      </w:r>
-    </w:p>
-    <w:p>
-      <w:pPr>
-        <w:rPr>
-          <w:rFonts w:cs="Times New Roman"/>
-          <w:color w:val="7F7F7F" w:themeColor="text1" w:themeTint="80"/>
-          <w:szCs w:val="20"/>
-        </w:rPr>
-      </w:pPr>
-      <w:r>
-        <w:rPr>
-          <w:rFonts w:cs="Times New Roman"/>
-          <w:b/>
-          <w:bCs/>
-          <w:color w:val="000000" w:themeColor="text1"/>
-          <w:szCs w:val="20"/>
-        </w:rPr>
-        <w:t>Deep Learning</w:t>
-      </w:r>
-      <w:r>
-        <w:rPr>
-          <w:rFonts w:cs="Times New Roman"/>
-          <w:b/>
-          <w:bCs/>
-          <w:color w:val="000000" w:themeColor="text1"/>
-          <w:szCs w:val="20"/>
-        </w:rPr>
-        <w:t xml:space="preserve">     </w:t>
-      </w:r>
-      <w:r>
-        <w:rPr>
-          <w:rFonts w:cs="Times New Roman"/>
-          <w:color w:val="7F7F7F" w:themeColor="text1" w:themeTint="80"/>
-          <w:szCs w:val="20"/>
-        </w:rPr>
-        <w:t>TensorFlow</w:t>
-      </w:r>
-    </w:p>
-    <w:p>
-      <w:pPr>
-        <w:rPr>
-          <w:rFonts w:cs="Times New Roman"/>
-          <w:b/>
-          <w:bCs/>
-          <w:color w:val="000000" w:themeColor="text1"/>
-          <w:szCs w:val="20"/>
-        </w:rPr>
-      </w:pPr>
-      <w:r>
-        <w:rPr>
-          <w:rFonts w:cs="Times New Roman"/>
-          <w:b/>
-          <w:bCs/>
-          <w:color w:val="000000" w:themeColor="text1"/>
-          <w:szCs w:val="20"/>
-        </w:rPr>
-        <w:t>Data Analysis</w:t>
-      </w:r>
-      <w:r>
-        <w:rPr>
-          <w:rFonts w:cs="Times New Roman" w:hint="eastAsia"/>
-          <w:b/>
-          <w:bCs/>
-          <w:color w:val="000000" w:themeColor="text1"/>
-          <w:szCs w:val="20"/>
-        </w:rPr>
-        <w:t xml:space="preserve"> </w:t>
-      </w:r>
-      <w:r>
-        <w:rPr>
-          <w:rFonts w:cs="Times New Roman"/>
-          <w:b/>
-          <w:bCs/>
-          <w:color w:val="000000" w:themeColor="text1"/>
-          <w:szCs w:val="20"/>
-        </w:rPr>
-        <w:t xml:space="preserve">     </w:t>
-      </w:r>
-      <w:proofErr w:type="spellStart"/>
-      <w:r>
-        <w:rPr>
-          <w:rFonts w:cs="Times New Roman"/>
-          <w:color w:val="7F7F7F" w:themeColor="text1" w:themeTint="80"/>
-          <w:szCs w:val="20"/>
-        </w:rPr>
-        <w:t>Num</w:t>
-      </w:r>
-      <w:r>
-        <w:rPr>
-          <w:rFonts w:cs="Times New Roman"/>
-          <w:color w:val="7F7F7F" w:themeColor="text1" w:themeTint="80"/>
-          <w:szCs w:val="20"/>
-        </w:rPr>
-        <w:t>py</w:t>
-      </w:r>
-      <w:proofErr w:type="spellEnd"/>
-      <w:r>
-        <w:rPr>
-          <w:rFonts w:cs="Times New Roman"/>
-          <w:color w:val="7F7F7F" w:themeColor="text1" w:themeTint="80"/>
-          <w:szCs w:val="20"/>
-        </w:rPr>
-        <w:t xml:space="preserve">, Pandas, </w:t>
-      </w:r>
-      <w:r>
-        <w:rPr>
-          <w:rFonts w:cs="Times New Roman"/>
-          <w:color w:val="7F7F7F" w:themeColor="text1" w:themeTint="80"/>
-          <w:szCs w:val="20"/>
-        </w:rPr>
-        <w:t xml:space="preserve">Polars, </w:t>
-      </w:r>
-      <w:proofErr w:type="spellStart"/>
-      <w:r>
-        <w:rPr>
-          <w:rFonts w:cs="Times New Roman"/>
-          <w:color w:val="7F7F7F" w:themeColor="text1" w:themeTint="80"/>
-          <w:szCs w:val="20"/>
-        </w:rPr>
-        <w:t>ndarray</w:t>
-      </w:r>
-      <w:proofErr w:type="spellEnd"/>
-      <w:r>
-        <w:rPr>
-          <w:rFonts w:cs="Times New Roman" w:hint="eastAsia"/>
-          <w:color w:val="7F7F7F" w:themeColor="text1" w:themeTint="80"/>
-          <w:szCs w:val="20"/>
-        </w:rPr>
-        <w:t xml:space="preserve"> </w:t>
+      </w:pPr>
+      <w:r/>
+      <w:r>
+        <w:rPr>
+          <w:rFonts w:ascii="IBM Plex Sans" w:hAnsi="IBM Plex Sans"/>
+          <w:b/>
+          <w:sz w:val="20"/>
+        </w:rPr>
+        <w:t xml:space="preserve">Data Analysis      </w:t>
+      </w:r>
+      <w:r>
+        <w:rPr>
+          <w:rFonts w:ascii="IBM Plex Sans" w:hAnsi="IBM Plex Sans"/>
+          <w:color w:val="7F7F7F"/>
+          <w:sz w:val="20"/>
+        </w:rPr>
+        <w:t>NumPy, Pandas, SciPy</w:t>
       </w:r>
     </w:p>
     <w:sectPr>

</xml_diff>

<commit_message>
Align CV docx/html projects and tech stack with Computational Psychiatry narrative
</commit_message>
<xml_diff>
--- a/Junho_Heo_CV.docx
+++ b/Junho_Heo_CV.docx
@@ -767,11 +767,12 @@
       </w:pPr>
       <w:r/>
       <w:r>
-        <w:rPr/>
+        <w:rPr>
+          <w:color w:val="7F7F7F"/>
+        </w:rPr>
         <w:t>Division of Computer Engineering (Software Major)</w:t>
       </w:r>
       <w:r>
-        <w:rPr/>
         <w:tab/>
       </w:r>
       <w:r>
@@ -791,19 +792,37 @@
           <w:color w:val="7F7F7F" w:themeColor="text1" w:themeTint="80"/>
         </w:rPr>
       </w:pPr>
-      <w:r/>
-      <w:r>
-        <w:rPr>
-          <w:b w:val="0"/>
-        </w:rPr>
-        <w:t xml:space="preserve">• </w:t>
-      </w:r>
-      <w:r>
-        <w:rPr>
-          <w:b w:val="0"/>
-          <w:color w:val="000000"/>
-        </w:rPr>
-        <w:t>Total GPA of 2.99/4.5, Major GPA 3.24/4.5 (Credits taken: 97.5/120)</w:t>
+      <w:r>
+        <w:rPr>
+          <w:color w:val="000000" w:themeColor="text1"/>
+        </w:rPr>
+        <w:t>• Total GPA of 2.99/4.5, Major GPA 3.24/4.5 (Credits taken: 97.5/120)</w:t>
+      </w:r>
+      <w:r>
+        <w:rPr>
+          <w:color w:val="7F7F7F" w:themeColor="text1" w:themeTint="80"/>
+        </w:rPr>
+      </w:r>
+      <w:r>
+        <w:rPr>
+          <w:color w:val="7F7F7F" w:themeColor="text1" w:themeTint="80"/>
+        </w:rPr>
+      </w:r>
+      <w:r>
+        <w:rPr>
+          <w:color w:val="7F7F7F" w:themeColor="text1" w:themeTint="80"/>
+        </w:rPr>
+      </w:r>
+      <w:r>
+        <w:rPr>
+          <w:rFonts w:hint="eastAsia"/>
+          <w:color w:val="7F7F7F" w:themeColor="text1" w:themeTint="80"/>
+        </w:rPr>
+      </w:r>
+      <w:r>
+        <w:rPr>
+          <w:color w:val="7F7F7F" w:themeColor="text1" w:themeTint="80"/>
+        </w:rPr>
       </w:r>
     </w:p>
     <w:p>
@@ -835,208 +854,226 @@
         <w:t>Project Experience</w:t>
       </w:r>
     </w:p>
+    <w:p>
+      <w:pPr>
+        <w:rPr>
+          <w:b/>
+          <w:bCs/>
+        </w:rPr>
+      </w:pPr>
+    </w:p>
+    <w:p>
+      <w:pPr>
+        <w:rPr>
+          <w:b/>
+          <w:bCs/>
+          <w:color w:val="7F7F7F" w:themeColor="text1" w:themeTint="80"/>
+          <w:sz w:val="36"/>
+          <w:szCs w:val="36"/>
+        </w:rPr>
+      </w:pPr>
+    </w:p>
+    <w:p>
+      <w:pPr>
+        <w:rPr>
+          <w:b/>
+          <w:bCs/>
+          <w:color w:val="7F7F7F" w:themeColor="text1" w:themeTint="80"/>
+          <w:sz w:val="36"/>
+          <w:szCs w:val="36"/>
+        </w:rPr>
+      </w:pPr>
+    </w:p>
+    <w:p>
+      <w:pPr>
+        <w:rPr>
+          <w:b/>
+          <w:bCs/>
+          <w:color w:val="7F7F7F" w:themeColor="text1" w:themeTint="80"/>
+          <w:sz w:val="36"/>
+          <w:szCs w:val="36"/>
+        </w:rPr>
+      </w:pPr>
+    </w:p>
     <w:p/>
     <w:p>
-      <w:r>
-        <w:rPr>
-          <w:rFonts w:ascii="IBM Plex Sans" w:hAnsi="IBM Plex Sans"/>
-          <w:sz w:val="20"/>
-        </w:rPr>
+      <w:pPr/>
+      <w:r>
+        <w:rPr>
+          <w:b/>
+        </w:rPr>
+        <w:t>TrendXiv (TrendXiv)</w:t>
+      </w:r>
+    </w:p>
+    <w:p>
+      <w:pPr>
+        <w:ind w:firstLine="211"/>
+      </w:pPr>
+      <w:r>
+        <w:rPr/>
         <w:t xml:space="preserve">• </w:t>
       </w:r>
       <w:r>
         <w:rPr>
-          <w:rFonts w:ascii="IBM Plex Sans" w:hAnsi="IBM Plex Sans"/>
           <w:color w:val="7F7F7F"/>
-          <w:sz w:val="20"/>
+        </w:rPr>
+        <w:t>Developed an arXiv paper trend prediction system utilizing PCA and machine learning classifiers.</w:t>
+      </w:r>
+    </w:p>
+    <w:p>
+      <w:pPr>
+        <w:ind w:firstLine="211"/>
+      </w:pPr>
+      <w:r>
+        <w:rPr/>
+        <w:t xml:space="preserve">• </w:t>
+      </w:r>
+      <w:r>
+        <w:rPr>
+          <w:color w:val="7F7F7F"/>
+        </w:rPr>
+        <w:t>Optimized data processing and pipeline design for structured academic paper data.</w:t>
+      </w:r>
+    </w:p>
+    <w:p>
+      <w:pPr/>
+      <w:r>
+        <w:rPr>
+          <w:b/>
+        </w:rPr>
+        <w:t>Drug–Drug Interaction Detection (ConvDDI)</w:t>
+      </w:r>
+    </w:p>
+    <w:p>
+      <w:pPr>
+        <w:ind w:firstLine="211"/>
+      </w:pPr>
+      <w:r>
+        <w:rPr/>
+        <w:t xml:space="preserve">• </w:t>
+      </w:r>
+      <w:r>
+        <w:rPr>
+          <w:color w:val="7F7F7F"/>
+        </w:rPr>
+        <w:t>Built a Convolutional Neural Network (CNN) model for predicting drug–drug interactions.</w:t>
+      </w:r>
+    </w:p>
+    <w:p>
+      <w:pPr>
+        <w:ind w:firstLine="211"/>
+      </w:pPr>
+      <w:r>
+        <w:rPr/>
+        <w:t xml:space="preserve">• </w:t>
+      </w:r>
+      <w:r>
+        <w:rPr>
+          <w:color w:val="7F7F7F"/>
+        </w:rPr>
+        <w:t>Experienced preprocessing chemical representation data and training deep learning models.</w:t>
+      </w:r>
+    </w:p>
+    <w:p>
+      <w:pPr/>
+      <w:r>
+        <w:rPr>
+          <w:b/>
+        </w:rPr>
+        <w:t>Decision Making Computational Modeling (sobdm-project)</w:t>
+      </w:r>
+    </w:p>
+    <w:p>
+      <w:pPr>
+        <w:ind w:firstLine="211"/>
+      </w:pPr>
+      <w:r>
+        <w:rPr/>
+        <w:t xml:space="preserve">• </w:t>
+      </w:r>
+      <w:r>
+        <w:rPr>
+          <w:color w:val="7F7F7F"/>
+        </w:rPr>
+        <w:t>Developed a reinforcement learning (Q-learning) fitting and simulation engine for 2-step decision making task data.</w:t>
+      </w:r>
+    </w:p>
+    <w:p>
+      <w:pPr>
+        <w:ind w:firstLine="211"/>
+      </w:pPr>
+      <w:r>
+        <w:rPr/>
+        <w:t xml:space="preserve">• </w:t>
+      </w:r>
+      <w:r>
+        <w:rPr>
+          <w:color w:val="7F7F7F"/>
+        </w:rPr>
+        <w:t>Experienced fitting behavioral data to cognitive models to quantify individual differences in decision making.</w:t>
+      </w:r>
+    </w:p>
+    <w:p>
+      <w:pPr/>
+      <w:r>
+        <w:rPr>
+          <w:b/>
+        </w:rPr>
+        <w:t>Magnolia (Magnolia)</w:t>
+      </w:r>
+    </w:p>
+    <w:p>
+      <w:pPr>
+        <w:ind w:firstLine="211"/>
+      </w:pPr>
+      <w:r>
+        <w:rPr/>
+        <w:t xml:space="preserve">• </w:t>
+      </w:r>
+      <w:r>
+        <w:rPr>
+          <w:color w:val="7F7F7F"/>
+        </w:rPr>
+        <w:t>Built a Python template pipeline for EEG and fMRI neural signal preprocessing and machine learning model training.</w:t>
+      </w:r>
+    </w:p>
+    <w:p>
+      <w:pPr>
+        <w:ind w:firstLine="211"/>
+      </w:pPr>
+      <w:r>
+        <w:rPr/>
+        <w:t xml:space="preserve">• </w:t>
+      </w:r>
+      <w:r>
+        <w:rPr>
+          <w:color w:val="7F7F7F"/>
+        </w:rPr>
+        <w:t>Streamlined data ingestion and feature extraction from complex neuroimaging formats.</w:t>
+      </w:r>
+    </w:p>
+    <w:p>
+      <w:pPr/>
+      <w:r>
+        <w:rPr>
+          <w:b/>
+        </w:rPr>
+        <w:t>Personal Website Development (junho.art)</w:t>
+      </w:r>
+    </w:p>
+    <w:p>
+      <w:pPr>
+        <w:ind w:firstLine="211"/>
+      </w:pPr>
+      <w:r>
+        <w:rPr/>
+        <w:t xml:space="preserve">• </w:t>
+      </w:r>
+      <w:r>
+        <w:rPr>
+          <w:color w:val="7F7F7F"/>
         </w:rPr>
         <w:t>Developed a responsive personal portfolio website from scratch using HTML, CSS, and JavaScript.</w:t>
-      </w:r>
-    </w:p>
-    <w:p>
-      <w:r>
-        <w:rPr>
-          <w:rFonts w:ascii="IBM Plex Sans" w:hAnsi="IBM Plex Sans"/>
-          <w:b/>
-          <w:sz w:val="22"/>
-        </w:rPr>
-        <w:t>Personal Website Development (junho.art)</w:t>
-      </w:r>
-    </w:p>
-    <w:p>
-      <w:r>
-        <w:rPr>
-          <w:rFonts w:ascii="IBM Plex Sans" w:hAnsi="IBM Plex Sans"/>
-          <w:sz w:val="20"/>
-        </w:rPr>
-        <w:t xml:space="preserve">• </w:t>
-      </w:r>
-      <w:r>
-        <w:rPr>
-          <w:rFonts w:ascii="IBM Plex Sans" w:hAnsi="IBM Plex Sans"/>
-          <w:color w:val="7F7F7F"/>
-          <w:sz w:val="20"/>
-        </w:rPr>
-        <w:t>Designed background services and optimized data relaying processes.</w:t>
-      </w:r>
-    </w:p>
-    <w:p>
-      <w:r>
-        <w:rPr>
-          <w:rFonts w:ascii="IBM Plex Sans" w:hAnsi="IBM Plex Sans"/>
-          <w:sz w:val="20"/>
-        </w:rPr>
-        <w:t xml:space="preserve">• </w:t>
-      </w:r>
-      <w:r>
-        <w:rPr>
-          <w:rFonts w:ascii="IBM Plex Sans" w:hAnsi="IBM Plex Sans"/>
-          <w:color w:val="7F7F7F"/>
-          <w:sz w:val="20"/>
-        </w:rPr>
-        <w:t>Developed an API server that processes notification data, and an Android APK broadcasting to KakaoTalk.</w:t>
-      </w:r>
-    </w:p>
-    <w:p>
-      <w:r>
-        <w:rPr>
-          <w:rFonts w:ascii="IBM Plex Sans" w:hAnsi="IBM Plex Sans"/>
-          <w:b/>
-          <w:sz w:val="22"/>
-        </w:rPr>
-        <w:t>Magnolia (Magnolia)</w:t>
-      </w:r>
-    </w:p>
-    <w:p>
-      <w:r>
-        <w:rPr>
-          <w:rFonts w:ascii="IBM Plex Sans" w:hAnsi="IBM Plex Sans"/>
-          <w:sz w:val="20"/>
-        </w:rPr>
-        <w:t xml:space="preserve">• </w:t>
-      </w:r>
-      <w:r>
-        <w:rPr>
-          <w:rFonts w:ascii="IBM Plex Sans" w:hAnsi="IBM Plex Sans"/>
-          <w:color w:val="7F7F7F"/>
-          <w:sz w:val="20"/>
-        </w:rPr>
-        <w:t>Performed feature engineering and model evaluation to achieve high accuracy.</w:t>
-      </w:r>
-    </w:p>
-    <w:p>
-      <w:r>
-        <w:rPr>
-          <w:rFonts w:ascii="IBM Plex Sans" w:hAnsi="IBM Plex Sans"/>
-          <w:sz w:val="20"/>
-        </w:rPr>
-        <w:t xml:space="preserve">• </w:t>
-      </w:r>
-      <w:r>
-        <w:rPr>
-          <w:rFonts w:ascii="IBM Plex Sans" w:hAnsi="IBM Plex Sans"/>
-          <w:color w:val="7F7F7F"/>
-          <w:sz w:val="20"/>
-        </w:rPr>
-        <w:t>Implemented a bus arrival delay prediction model for Seongnam City Bus #109 using Multilayer Perceptron (MLP).</w:t>
-      </w:r>
-    </w:p>
-    <w:p>
-      <w:r>
-        <w:rPr>
-          <w:rFonts w:ascii="IBM Plex Sans" w:hAnsi="IBM Plex Sans"/>
-          <w:b/>
-          <w:sz w:val="22"/>
-        </w:rPr>
-        <w:t>Bus Delay Prediction Model (sobdm-project)</w:t>
-      </w:r>
-    </w:p>
-    <w:p>
-      <w:r>
-        <w:rPr>
-          <w:rFonts w:ascii="IBM Plex Sans" w:hAnsi="IBM Plex Sans"/>
-          <w:sz w:val="20"/>
-        </w:rPr>
-        <w:t xml:space="preserve">• </w:t>
-      </w:r>
-      <w:r>
-        <w:rPr>
-          <w:rFonts w:ascii="IBM Plex Sans" w:hAnsi="IBM Plex Sans"/>
-          <w:color w:val="7F7F7F"/>
-          <w:sz w:val="20"/>
-        </w:rPr>
-        <w:t>Experienced preprocessing chemical representation data and training deep learning models.</w:t>
-      </w:r>
-    </w:p>
-    <w:p>
-      <w:r>
-        <w:rPr>
-          <w:rFonts w:ascii="IBM Plex Sans" w:hAnsi="IBM Plex Sans"/>
-          <w:sz w:val="20"/>
-        </w:rPr>
-        <w:t xml:space="preserve">• </w:t>
-      </w:r>
-      <w:r>
-        <w:rPr>
-          <w:rFonts w:ascii="IBM Plex Sans" w:hAnsi="IBM Plex Sans"/>
-          <w:color w:val="7F7F7F"/>
-          <w:sz w:val="20"/>
-        </w:rPr>
-        <w:t>Built a Convolutional Neural Network (CNN) model for predicting drug–drug interactions.</w:t>
-      </w:r>
-    </w:p>
-    <w:p>
-      <w:r>
-        <w:rPr>
-          <w:rFonts w:ascii="IBM Plex Sans" w:hAnsi="IBM Plex Sans"/>
-          <w:b/>
-          <w:sz w:val="22"/>
-        </w:rPr>
-        <w:t>Drug–Drug Interaction Detection (ConvDDI)</w:t>
-      </w:r>
-    </w:p>
-    <w:p>
-      <w:r>
-        <w:rPr>
-          <w:rFonts w:ascii="IBM Plex Sans" w:hAnsi="IBM Plex Sans"/>
-          <w:sz w:val="20"/>
-        </w:rPr>
-        <w:t xml:space="preserve">• </w:t>
-      </w:r>
-      <w:r>
-        <w:rPr>
-          <w:rFonts w:ascii="IBM Plex Sans" w:hAnsi="IBM Plex Sans"/>
-          <w:color w:val="7F7F7F"/>
-          <w:sz w:val="20"/>
-        </w:rPr>
-        <w:t>Optimized data processing and pipeline design for structured academic paper data.</w:t>
-      </w:r>
-    </w:p>
-    <w:p>
-      <w:r>
-        <w:rPr>
-          <w:rFonts w:ascii="IBM Plex Sans" w:hAnsi="IBM Plex Sans"/>
-          <w:sz w:val="20"/>
-        </w:rPr>
-        <w:t xml:space="preserve">• </w:t>
-      </w:r>
-      <w:r>
-        <w:rPr>
-          <w:rFonts w:ascii="IBM Plex Sans" w:hAnsi="IBM Plex Sans"/>
-          <w:color w:val="7F7F7F"/>
-          <w:sz w:val="20"/>
-        </w:rPr>
-        <w:t>Developed an arXiv paper trend prediction system utilizing PCA and machine learning classifiers.</w:t>
-      </w:r>
-    </w:p>
-    <w:p>
-      <w:r>
-        <w:rPr>
-          <w:rFonts w:ascii="IBM Plex Sans" w:hAnsi="IBM Plex Sans"/>
-          <w:b/>
-          <w:sz w:val="22"/>
-        </w:rPr>
-        <w:t>TrendXiv (TrendXiv)</w:t>
       </w:r>
     </w:p>
     <w:p/>
@@ -1327,17 +1364,18 @@
       <w:r>
         <w:rPr>
           <w:b w:val="0"/>
+          <w:color w:val="7F7F7F"/>
         </w:rPr>
         <w:t xml:space="preserve">Spring 2026  </w:t>
       </w:r>
       <w:r>
         <w:rPr>
           <w:b/>
+          <w:color w:val="7F7F7F"/>
         </w:rPr>
         <w:t>Faculty Recommendation Scholarship</w:t>
       </w:r>
       <w:r>
-        <w:rPr/>
         <w:tab/>
       </w:r>
       <w:r>
@@ -1360,17 +1398,18 @@
       <w:r>
         <w:rPr>
           <w:b w:val="0"/>
+          <w:color w:val="7F7F7F"/>
         </w:rPr>
         <w:t xml:space="preserve">Fall 2025  </w:t>
       </w:r>
       <w:r>
         <w:rPr>
           <w:b/>
+          <w:color w:val="7F7F7F"/>
         </w:rPr>
         <w:t>Faculty Recommendation Scholarship [Repayment]</w:t>
       </w:r>
       <w:r>
-        <w:rPr/>
         <w:tab/>
       </w:r>
       <w:r>
@@ -1398,17 +1437,18 @@
       <w:r>
         <w:rPr>
           <w:b w:val="0"/>
+          <w:color w:val="7F7F7F"/>
         </w:rPr>
         <w:t xml:space="preserve">Spring 2024  </w:t>
       </w:r>
       <w:r>
         <w:rPr>
           <w:b/>
+          <w:color w:val="7F7F7F"/>
         </w:rPr>
         <w:t>Faculty Recommendation Scholarship</w:t>
       </w:r>
       <w:r>
-        <w:rPr/>
         <w:tab/>
       </w:r>
       <w:r>
@@ -1436,17 +1476,18 @@
       <w:r>
         <w:rPr>
           <w:b w:val="0"/>
+          <w:color w:val="7F7F7F"/>
         </w:rPr>
         <w:t xml:space="preserve">Spring 2021  </w:t>
       </w:r>
       <w:r>
         <w:rPr>
           <w:b/>
+          <w:color w:val="7F7F7F"/>
         </w:rPr>
         <w:t>National Scholarship (Type II)</w:t>
       </w:r>
       <w:r>
-        <w:rPr/>
         <w:tab/>
       </w:r>
       <w:r>
@@ -1852,78 +1893,78 @@
           <w:szCs w:val="20"/>
         </w:rPr>
       </w:pPr>
-      <w:r/>
-      <w:r>
-        <w:rPr>
-          <w:rFonts w:ascii="IBM Plex Sans" w:hAnsi="IBM Plex Sans"/>
-          <w:b/>
-          <w:sz w:val="20"/>
-        </w:rPr>
-        <w:t xml:space="preserve">Programming      </w:t>
-      </w:r>
-      <w:r>
-        <w:rPr>
-          <w:rFonts w:ascii="IBM Plex Sans" w:hAnsi="IBM Plex Sans"/>
-          <w:color w:val="7F7F7F"/>
-          <w:sz w:val="20"/>
-        </w:rPr>
-        <w:t>Python, Rust, Kotlin, Java, JavaScript, HTML/CSS</w:t>
-      </w:r>
-    </w:p>
-    <w:p>
-      <w:pPr>
+      <w:r>
+        <w:rPr>
+          <w:rFonts w:cs="Times New Roman"/>
+          <w:b/>
+          <w:bCs/>
+          <w:color w:val="000000" w:themeColor="text1"/>
+          <w:szCs w:val="20"/>
+        </w:rPr>
+        <w:t>Programming</w:t>
+      </w:r>
+      <w:r>
+        <w:rPr>
+          <w:rFonts w:cs="Times New Roman"/>
+          <w:b/>
+          <w:bCs/>
+          <w:color w:val="000000" w:themeColor="text1"/>
+          <w:szCs w:val="20"/>
+        </w:rPr>
+        <w:t xml:space="preserve"> </w:t>
+      </w:r>
+      <w:r>
+        <w:rPr>
+          <w:rFonts w:cs="Times New Roman"/>
+          <w:color w:val="000000" w:themeColor="text1"/>
+          <w:szCs w:val="20"/>
+        </w:rPr>
+        <w:t xml:space="preserve">     </w:t>
+      </w:r>
+      <w:r>
         <w:rPr>
           <w:rFonts w:cs="Times New Roman"/>
           <w:color w:val="7F7F7F" w:themeColor="text1" w:themeTint="80"/>
           <w:szCs w:val="20"/>
         </w:rPr>
-      </w:pPr>
-      <w:r/>
-      <w:r>
-        <w:rPr>
-          <w:rFonts w:ascii="IBM Plex Sans" w:hAnsi="IBM Plex Sans"/>
-          <w:b/>
-          <w:sz w:val="20"/>
-        </w:rPr>
-        <w:t xml:space="preserve">Machine Learning  </w:t>
-      </w:r>
-      <w:r>
-        <w:rPr>
-          <w:rFonts w:ascii="IBM Plex Sans" w:hAnsi="IBM Plex Sans"/>
-          <w:color w:val="7F7F7F"/>
-          <w:sz w:val="20"/>
-        </w:rPr>
-        <w:t>Scikit-learn</w:t>
-      </w:r>
-    </w:p>
-    <w:p>
-      <w:pPr>
+        <w:t>Python, JavaScript, HTML/CSS</w:t>
+      </w:r>
+      <w:r>
         <w:rPr>
           <w:rFonts w:cs="Times New Roman"/>
           <w:color w:val="7F7F7F" w:themeColor="text1" w:themeTint="80"/>
           <w:szCs w:val="20"/>
         </w:rPr>
-      </w:pPr>
-      <w:r/>
-      <w:r>
-        <w:rPr>
-          <w:rFonts w:ascii="IBM Plex Sans" w:hAnsi="IBM Plex Sans"/>
-          <w:b/>
-          <w:sz w:val="20"/>
-        </w:rPr>
-        <w:t xml:space="preserve">Deep Learning     </w:t>
-      </w:r>
-      <w:r>
-        <w:rPr>
-          <w:rFonts w:ascii="IBM Plex Sans" w:hAnsi="IBM Plex Sans"/>
-          <w:color w:val="7F7F7F"/>
-          <w:sz w:val="20"/>
-        </w:rPr>
-        <w:t>PyTorch</w:t>
-      </w:r>
-    </w:p>
-    <w:p>
-      <w:pPr>
+        <w:t xml:space="preserve">, </w:t>
+      </w:r>
+      <w:proofErr w:type="spellStart"/>
+      <w:r>
+        <w:rPr>
+          <w:rFonts w:cs="Times New Roman"/>
+          <w:color w:val="7F7F7F" w:themeColor="text1" w:themeTint="80"/>
+          <w:szCs w:val="20"/>
+        </w:rPr>
+        <w:t>p</w:t>
+      </w:r>
+      <w:r>
+        <w:rPr>
+          <w:rFonts w:cs="Times New Roman"/>
+          <w:color w:val="7F7F7F" w:themeColor="text1" w:themeTint="80"/>
+          <w:szCs w:val="20"/>
+        </w:rPr>
+        <w:t>hp</w:t>
+      </w:r>
+      <w:proofErr w:type="spellEnd"/>
+    </w:p>
+    <w:p>
+      <w:pPr>
+        <w:rPr>
+          <w:rFonts w:cs="Times New Roman"/>
+          <w:color w:val="7F7F7F" w:themeColor="text1" w:themeTint="80"/>
+          <w:szCs w:val="20"/>
+        </w:rPr>
+      </w:pPr>
+      <w:r>
         <w:rPr>
           <w:rFonts w:cs="Times New Roman"/>
           <w:b/>
@@ -1931,23 +1972,161 @@
           <w:color w:val="000000" w:themeColor="text1"/>
           <w:szCs w:val="20"/>
         </w:rPr>
-      </w:pPr>
-      <w:r/>
-      <w:r>
-        <w:rPr>
-          <w:rFonts w:ascii="IBM Plex Sans" w:hAnsi="IBM Plex Sans"/>
-          <w:b/>
-          <w:sz w:val="20"/>
-        </w:rPr>
-        <w:t xml:space="preserve">Data Analysis      </w:t>
-      </w:r>
-      <w:r>
-        <w:rPr>
-          <w:rFonts w:ascii="IBM Plex Sans" w:hAnsi="IBM Plex Sans"/>
-          <w:color w:val="7F7F7F"/>
-          <w:sz w:val="20"/>
+        <w:t>Machine Learning</w:t>
+      </w:r>
+      <w:r>
+        <w:rPr>
+          <w:rFonts w:cs="Times New Roman"/>
+          <w:b/>
+          <w:bCs/>
+          <w:color w:val="000000" w:themeColor="text1"/>
+          <w:szCs w:val="20"/>
+        </w:rPr>
+        <w:t xml:space="preserve">  </w:t>
+      </w:r>
+      <w:proofErr w:type="spellStart"/>
+      <w:r>
+        <w:rPr>
+          <w:rFonts w:cs="Times New Roman"/>
+          <w:color w:val="7F7F7F" w:themeColor="text1" w:themeTint="80"/>
+          <w:szCs w:val="20"/>
+        </w:rPr>
+        <w:t>Scikit-learn</w:t>
+      </w:r>
+      <w:proofErr w:type="spellEnd"/>
+      <w:r>
+        <w:rPr>
+          <w:rFonts w:cs="Times New Roman"/>
+          <w:color w:val="7F7F7F" w:themeColor="text1" w:themeTint="80"/>
+          <w:szCs w:val="20"/>
+        </w:rPr>
+        <w:t>-learn</w:t>
+      </w:r>
+    </w:p>
+    <w:p>
+      <w:pPr>
+        <w:rPr>
+          <w:rFonts w:cs="Times New Roman"/>
+          <w:color w:val="7F7F7F" w:themeColor="text1" w:themeTint="80"/>
+          <w:szCs w:val="20"/>
+        </w:rPr>
+      </w:pPr>
+      <w:r>
+        <w:rPr>
+          <w:rFonts w:cs="Times New Roman"/>
+          <w:b/>
+          <w:bCs/>
+          <w:color w:val="000000" w:themeColor="text1"/>
+          <w:szCs w:val="20"/>
+        </w:rPr>
+        <w:t>Deep Learning</w:t>
+      </w:r>
+      <w:r>
+        <w:rPr>
+          <w:rFonts w:cs="Times New Roman"/>
+          <w:b/>
+          <w:bCs/>
+          <w:color w:val="000000" w:themeColor="text1"/>
+          <w:szCs w:val="20"/>
+        </w:rPr>
+        <w:t xml:space="preserve">     </w:t>
+      </w:r>
+      <w:r>
+        <w:rPr>
+          <w:rFonts w:cs="Times New Roman"/>
+          <w:color w:val="7F7F7F" w:themeColor="text1" w:themeTint="80"/>
+          <w:szCs w:val="20"/>
+        </w:rPr>
+        <w:t>PyTorch</w:t>
+      </w:r>
+    </w:p>
+    <w:p>
+      <w:pPr>
+        <w:rPr>
+          <w:rFonts w:cs="Times New Roman"/>
+          <w:b/>
+          <w:bCs/>
+          <w:color w:val="000000" w:themeColor="text1"/>
+          <w:szCs w:val="20"/>
+        </w:rPr>
+      </w:pPr>
+      <w:r>
+        <w:rPr>
+          <w:rFonts w:cs="Times New Roman"/>
+          <w:b/>
+          <w:bCs/>
+          <w:color w:val="000000" w:themeColor="text1"/>
+          <w:szCs w:val="20"/>
+        </w:rPr>
+        <w:t>Data Analysis</w:t>
+      </w:r>
+      <w:r>
+        <w:rPr>
+          <w:rFonts w:cs="Times New Roman" w:hint="eastAsia"/>
+          <w:b/>
+          <w:bCs/>
+          <w:color w:val="000000" w:themeColor="text1"/>
+          <w:szCs w:val="20"/>
+        </w:rPr>
+        <w:t xml:space="preserve"> </w:t>
+      </w:r>
+      <w:r>
+        <w:rPr>
+          <w:rFonts w:cs="Times New Roman"/>
+          <w:b/>
+          <w:bCs/>
+          <w:color w:val="000000" w:themeColor="text1"/>
+          <w:szCs w:val="20"/>
+        </w:rPr>
+        <w:t xml:space="preserve">     </w:t>
+      </w:r>
+      <w:proofErr w:type="spellStart"/>
+      <w:r>
+        <w:rPr>
+          <w:rFonts w:cs="Times New Roman"/>
+          <w:color w:val="7F7F7F" w:themeColor="text1" w:themeTint="80"/>
+          <w:szCs w:val="20"/>
         </w:rPr>
         <w:t>NumPy, Pandas, SciPy</w:t>
+      </w:r>
+      <w:r>
+        <w:rPr>
+          <w:rFonts w:cs="Times New Roman"/>
+          <w:color w:val="7F7F7F" w:themeColor="text1" w:themeTint="80"/>
+          <w:szCs w:val="20"/>
+        </w:rPr>
+      </w:r>
+      <w:proofErr w:type="spellEnd"/>
+      <w:r>
+        <w:rPr>
+          <w:rFonts w:cs="Times New Roman"/>
+          <w:color w:val="7F7F7F" w:themeColor="text1" w:themeTint="80"/>
+          <w:szCs w:val="20"/>
+        </w:rPr>
+      </w:r>
+      <w:r>
+        <w:rPr>
+          <w:rFonts w:cs="Times New Roman"/>
+          <w:color w:val="7F7F7F" w:themeColor="text1" w:themeTint="80"/>
+          <w:szCs w:val="20"/>
+        </w:rPr>
+      </w:r>
+      <w:proofErr w:type="spellStart"/>
+      <w:r>
+        <w:rPr>
+          <w:rFonts w:cs="Times New Roman"/>
+          <w:color w:val="7F7F7F" w:themeColor="text1" w:themeTint="80"/>
+          <w:szCs w:val="20"/>
+        </w:rPr>
+      </w:r>
+      <w:proofErr w:type="spellEnd"/>
+      <w:r>
+        <w:rPr>
+          <w:rFonts w:cs="Times New Roman" w:hint="eastAsia"/>
+          <w:color w:val="7F7F7F" w:themeColor="text1" w:themeTint="80"/>
+          <w:szCs w:val="20"/>
+        </w:rPr>
+        <w:t xml:space="preserve"> </w:t>
       </w:r>
     </w:p>
     <w:sectPr>

</xml_diff>

<commit_message>
Fix incorrect project descriptions reintroduced by faulty agent edit
Magnolia and sobdm-project descriptions had been overwritten with
fabricated content (EEG/fMRI pipeline, Q-learning model) that doesn't
match the actual projects. Restore the correct descriptions (KakaoTalk
notification bot, bus arrival delay MLP) in both script.js and the CV docx.

Co-Authored-By: Claude Sonnet 4.6 <noreply@anthropic.com>
</commit_message>
<xml_diff>
--- a/Junho_Heo_CV.docx
+++ b/Junho_Heo_CV.docx
@@ -184,15 +184,7 @@
                                 <w:sz w:val="15"/>
                                 <w:szCs w:val="16"/>
                               </w:rPr>
-                              <w:t>︎</w:t>
-                            </w:r>
-                            <w:r>
-                              <w:rPr>
-                                <w:rFonts w:ascii="IBM Plex Sans" w:eastAsia="Apple Color Emoji" w:hAnsi="IBM Plex Sans"/>
-                                <w:sz w:val="15"/>
-                                <w:szCs w:val="16"/>
-                              </w:rPr>
-                              <w:t xml:space="preserve"> </w:t>
+                              <w:t xml:space="preserve">︎ </w:t>
                             </w:r>
                             <w:hyperlink r:id="rId6" w:history="1">
                               <w:r>
@@ -211,15 +203,7 @@
                                 <w:sz w:val="15"/>
                                 <w:szCs w:val="16"/>
                               </w:rPr>
-                              <w:t xml:space="preserve"> </w:t>
-                            </w:r>
-                            <w:r>
-                              <w:rPr>
-                                <w:rFonts w:ascii="IBM Plex Sans" w:hAnsi="IBM Plex Sans"/>
-                                <w:sz w:val="15"/>
-                                <w:szCs w:val="16"/>
-                              </w:rPr>
-                              <w:t xml:space="preserve">| </w:t>
+                              <w:t xml:space="preserve"> | </w:t>
                             </w:r>
                             <w:r>
                               <w:rPr>
@@ -325,14 +309,7 @@
                                 <w:i/>
                                 <w:iCs/>
                               </w:rPr>
-                              <w:t xml:space="preserve"> </w:t>
-                            </w:r>
-                            <w:r>
-                              <w:rPr>
-                                <w:i/>
-                                <w:iCs/>
-                              </w:rPr>
-                              <w:t>“Finding structure in complex problems is an art.”</w:t>
+                              <w:t xml:space="preserve"> “Finding structure in complex problems is an art.”</w:t>
                             </w:r>
                           </w:p>
                           <w:p/>
@@ -454,15 +431,7 @@
                           <w:sz w:val="15"/>
                           <w:szCs w:val="16"/>
                         </w:rPr>
-                        <w:t>︎</w:t>
-                      </w:r>
-                      <w:r>
-                        <w:rPr>
-                          <w:rFonts w:ascii="IBM Plex Sans" w:eastAsia="Apple Color Emoji" w:hAnsi="IBM Plex Sans"/>
-                          <w:sz w:val="15"/>
-                          <w:szCs w:val="16"/>
-                        </w:rPr>
-                        <w:t xml:space="preserve"> </w:t>
+                        <w:t xml:space="preserve">︎ </w:t>
                       </w:r>
                       <w:hyperlink r:id="rId9" w:history="1">
                         <w:r>
@@ -481,15 +450,7 @@
                           <w:sz w:val="15"/>
                           <w:szCs w:val="16"/>
                         </w:rPr>
-                        <w:t xml:space="preserve"> </w:t>
-                      </w:r>
-                      <w:r>
-                        <w:rPr>
-                          <w:rFonts w:ascii="IBM Plex Sans" w:hAnsi="IBM Plex Sans"/>
-                          <w:sz w:val="15"/>
-                          <w:szCs w:val="16"/>
-                        </w:rPr>
-                        <w:t xml:space="preserve">| </w:t>
+                        <w:t xml:space="preserve"> | </w:t>
                       </w:r>
                       <w:r>
                         <w:rPr>
@@ -595,14 +556,7 @@
                           <w:i/>
                           <w:iCs/>
                         </w:rPr>
-                        <w:t xml:space="preserve"> </w:t>
-                      </w:r>
-                      <w:r>
-                        <w:rPr>
-                          <w:i/>
-                          <w:iCs/>
-                        </w:rPr>
-                        <w:t>“Finding structure in complex problems is an art.”</w:t>
+                        <w:t xml:space="preserve"> “Finding structure in complex problems is an art.”</w:t>
                       </w:r>
                     </w:p>
                     <w:p/>
@@ -739,33 +693,23 @@
       </w:pPr>
     </w:p>
     <w:p>
-      <w:proofErr w:type="spellStart"/>
-      <w:r>
-        <w:rPr>
-          <w:b/>
-          <w:bCs/>
-        </w:rPr>
-        <w:t>Baekseok</w:t>
-      </w:r>
-      <w:proofErr w:type="spellEnd"/>
-      <w:r>
-        <w:rPr>
-          <w:b/>
-          <w:bCs/>
-        </w:rPr>
-        <w:t xml:space="preserve"> University</w:t>
+      <w:r>
+        <w:rPr>
+          <w:b/>
+          <w:bCs/>
+        </w:rPr>
+        <w:t>Baekseok University</w:t>
       </w:r>
     </w:p>
     <w:p>
       <w:pPr>
         <w:tabs>
-          <w:tab w:pos="9029" w:val="right"/>
+          <w:tab w:val="right" w:pos="9029"/>
         </w:tabs>
         <w:rPr>
           <w:color w:val="7F7F7F" w:themeColor="text1" w:themeTint="80"/>
         </w:rPr>
       </w:pPr>
-      <w:r/>
       <w:r>
         <w:rPr>
           <w:color w:val="7F7F7F"/>
@@ -777,7 +721,6 @@
       </w:r>
       <w:r>
         <w:rPr>
-          <w:b w:val="0"/>
           <w:i/>
           <w:color w:val="7F7F7F"/>
           <w:sz w:val="18"/>
@@ -798,32 +741,6 @@
         </w:rPr>
         <w:t>• Total GPA of 2.99/4.5, Major GPA 3.24/4.5 (Credits taken: 97.5/120)</w:t>
       </w:r>
-      <w:r>
-        <w:rPr>
-          <w:color w:val="7F7F7F" w:themeColor="text1" w:themeTint="80"/>
-        </w:rPr>
-      </w:r>
-      <w:r>
-        <w:rPr>
-          <w:color w:val="7F7F7F" w:themeColor="text1" w:themeTint="80"/>
-        </w:rPr>
-      </w:r>
-      <w:r>
-        <w:rPr>
-          <w:color w:val="7F7F7F" w:themeColor="text1" w:themeTint="80"/>
-        </w:rPr>
-      </w:r>
-      <w:r>
-        <w:rPr>
-          <w:rFonts w:hint="eastAsia"/>
-          <w:color w:val="7F7F7F" w:themeColor="text1" w:themeTint="80"/>
-        </w:rPr>
-      </w:r>
-      <w:r>
-        <w:rPr>
-          <w:color w:val="7F7F7F" w:themeColor="text1" w:themeTint="80"/>
-        </w:rPr>
-      </w:r>
     </w:p>
     <w:p>
       <w:pPr>
@@ -837,7 +754,7 @@
     <w:p>
       <w:pPr>
         <w:rPr>
-          <w:rFonts w:ascii="IBM Plex Sans" w:hAnsi="IBM Plex Sans"/>
+          <w:rFonts w:ascii="IBM Plex Sans" w:hAnsi="IBM Plex Sans" w:hint="eastAsia"/>
           <w:b/>
           <w:bCs/>
           <w:sz w:val="36"/>
@@ -858,225 +775,184 @@
       <w:pPr>
         <w:rPr>
           <w:b/>
-          <w:bCs/>
-        </w:rPr>
-      </w:pPr>
-    </w:p>
-    <w:p>
-      <w:pPr>
-        <w:rPr>
-          <w:b/>
-          <w:bCs/>
-          <w:color w:val="7F7F7F" w:themeColor="text1" w:themeTint="80"/>
-          <w:sz w:val="36"/>
-          <w:szCs w:val="36"/>
-        </w:rPr>
-      </w:pPr>
-    </w:p>
-    <w:p>
-      <w:pPr>
-        <w:rPr>
-          <w:b/>
-          <w:bCs/>
-          <w:color w:val="7F7F7F" w:themeColor="text1" w:themeTint="80"/>
-          <w:sz w:val="36"/>
-          <w:szCs w:val="36"/>
-        </w:rPr>
-      </w:pPr>
-    </w:p>
-    <w:p>
-      <w:pPr>
-        <w:rPr>
-          <w:b/>
-          <w:bCs/>
-          <w:color w:val="7F7F7F" w:themeColor="text1" w:themeTint="80"/>
-          <w:sz w:val="36"/>
-          <w:szCs w:val="36"/>
-        </w:rPr>
-      </w:pPr>
+        </w:rPr>
+      </w:pPr>
+    </w:p>
+    <w:p>
+      <w:r>
+        <w:rPr>
+          <w:b/>
+        </w:rPr>
+        <w:t>TrendXiv (TrendXiv)</w:t>
+      </w:r>
+    </w:p>
+    <w:p>
+      <w:pPr>
+        <w:ind w:firstLine="211"/>
+      </w:pPr>
+      <w:r>
+        <w:t xml:space="preserve">• </w:t>
+      </w:r>
+      <w:r>
+        <w:rPr>
+          <w:color w:val="7F7F7F"/>
+        </w:rPr>
+        <w:t>Developed an arXiv paper trend prediction system utilizing PCA and machine learning classifiers.</w:t>
+      </w:r>
+    </w:p>
+    <w:p>
+      <w:pPr>
+        <w:ind w:firstLine="211"/>
+      </w:pPr>
+      <w:r>
+        <w:t xml:space="preserve">• </w:t>
+      </w:r>
+      <w:r>
+        <w:rPr>
+          <w:color w:val="7F7F7F"/>
+        </w:rPr>
+        <w:t>Optimized data processing and pipeline design for structured academic paper data.</w:t>
+      </w:r>
+    </w:p>
+    <w:p>
+      <w:r>
+        <w:rPr>
+          <w:b/>
+        </w:rPr>
+        <w:t>Drug–Drug Interaction Detection (ConvDDI)</w:t>
+      </w:r>
+    </w:p>
+    <w:p>
+      <w:pPr>
+        <w:ind w:firstLine="211"/>
+      </w:pPr>
+      <w:r>
+        <w:t xml:space="preserve">• </w:t>
+      </w:r>
+      <w:r>
+        <w:rPr>
+          <w:color w:val="7F7F7F"/>
+        </w:rPr>
+        <w:t>Built a Convolutional Neural Network (CNN) model for predicting drug–drug interactions.</w:t>
+      </w:r>
+    </w:p>
+    <w:p>
+      <w:pPr>
+        <w:ind w:firstLine="211"/>
+      </w:pPr>
+      <w:r>
+        <w:t xml:space="preserve">• </w:t>
+      </w:r>
+      <w:r>
+        <w:rPr>
+          <w:color w:val="7F7F7F"/>
+        </w:rPr>
+        <w:t>Experienced preprocessing chemical representation data and training deep learning models.</w:t>
+      </w:r>
+    </w:p>
+    <w:p>
+      <w:r>
+        <w:rPr>
+          <w:b/>
+        </w:rPr>
+        <w:t>Bus Arrival Delay Prediction (sobdm-project)</w:t>
+      </w:r>
+    </w:p>
+    <w:p>
+      <w:pPr>
+        <w:ind w:firstLine="211"/>
+      </w:pPr>
+      <w:r>
+        <w:t xml:space="preserve">• </w:t>
+      </w:r>
+      <w:r>
+        <w:rPr>
+          <w:color w:val="7F7F7F"/>
+        </w:rPr>
+        <w:t>Developed a Multilayer Perceptron (MLP) model to predict arrival delays for Seongnam-si City Bus Route 109.</w:t>
+      </w:r>
+    </w:p>
+    <w:p>
+      <w:pPr>
+        <w:ind w:firstLine="211"/>
+      </w:pPr>
+      <w:r>
+        <w:t xml:space="preserve">• </w:t>
+      </w:r>
+      <w:r>
+        <w:rPr>
+          <w:color w:val="7F7F7F"/>
+        </w:rPr>
+        <w:t>Engineered features from historical bus GPS and schedule data to improve delay prediction accuracy.</w:t>
+      </w:r>
+    </w:p>
+    <w:p>
+      <w:r>
+        <w:rPr>
+          <w:b/>
+        </w:rPr>
+        <w:t>Magnolia (Magnolia)</w:t>
+      </w:r>
+    </w:p>
+    <w:p>
+      <w:pPr>
+        <w:ind w:firstLine="211"/>
+      </w:pPr>
+      <w:r>
+        <w:t xml:space="preserve">• </w:t>
+      </w:r>
+      <w:r>
+        <w:rPr>
+          <w:color w:val="7F7F7F"/>
+        </w:rPr>
+        <w:t>Built an intelligent KakaoTalk chatbot using Go, Rust, and Kotlin, with an API server that processes notification data and an APK that broadcasts to KakaoTalk.</w:t>
+      </w:r>
+    </w:p>
+    <w:p>
+      <w:pPr>
+        <w:ind w:firstLine="211"/>
+      </w:pPr>
+      <w:r>
+        <w:t xml:space="preserve">• </w:t>
+      </w:r>
+      <w:r>
+        <w:rPr>
+          <w:color w:val="7F7F7F"/>
+        </w:rPr>
+        <w:t>Automated task scheduling and notification delivery via the KakaoTalk API.</w:t>
+      </w:r>
+    </w:p>
+    <w:p>
+      <w:r>
+        <w:rPr>
+          <w:b/>
+        </w:rPr>
+        <w:t>Personal Website Development (junho.art)</w:t>
+      </w:r>
+    </w:p>
+    <w:p>
+      <w:pPr>
+        <w:ind w:firstLine="211"/>
+      </w:pPr>
+      <w:r>
+        <w:t xml:space="preserve">• </w:t>
+      </w:r>
+      <w:r>
+        <w:rPr>
+          <w:color w:val="7F7F7F"/>
+        </w:rPr>
+        <w:t>Developed a responsive personal portfolio website from scratch using HTML, CSS, and JavaScript.</w:t>
+      </w:r>
     </w:p>
     <w:p/>
-    <w:p>
-      <w:pPr/>
-      <w:r>
-        <w:rPr>
-          <w:b/>
-        </w:rPr>
-        <w:t>TrendXiv (TrendXiv)</w:t>
-      </w:r>
-    </w:p>
-    <w:p>
-      <w:pPr>
-        <w:ind w:firstLine="211"/>
-      </w:pPr>
-      <w:r>
-        <w:rPr/>
-        <w:t xml:space="preserve">• </w:t>
-      </w:r>
-      <w:r>
-        <w:rPr>
-          <w:color w:val="7F7F7F"/>
-        </w:rPr>
-        <w:t>Developed an arXiv paper trend prediction system utilizing PCA and machine learning classifiers.</w:t>
-      </w:r>
-    </w:p>
-    <w:p>
-      <w:pPr>
-        <w:ind w:firstLine="211"/>
-      </w:pPr>
-      <w:r>
-        <w:rPr/>
-        <w:t xml:space="preserve">• </w:t>
-      </w:r>
-      <w:r>
-        <w:rPr>
-          <w:color w:val="7F7F7F"/>
-        </w:rPr>
-        <w:t>Optimized data processing and pipeline design for structured academic paper data.</w:t>
-      </w:r>
-    </w:p>
-    <w:p>
-      <w:pPr/>
-      <w:r>
-        <w:rPr>
-          <w:b/>
-        </w:rPr>
-        <w:t>Drug–Drug Interaction Detection (ConvDDI)</w:t>
-      </w:r>
-    </w:p>
-    <w:p>
-      <w:pPr>
-        <w:ind w:firstLine="211"/>
-      </w:pPr>
-      <w:r>
-        <w:rPr/>
-        <w:t xml:space="preserve">• </w:t>
-      </w:r>
-      <w:r>
-        <w:rPr>
-          <w:color w:val="7F7F7F"/>
-        </w:rPr>
-        <w:t>Built a Convolutional Neural Network (CNN) model for predicting drug–drug interactions.</w:t>
-      </w:r>
-    </w:p>
-    <w:p>
-      <w:pPr>
-        <w:ind w:firstLine="211"/>
-      </w:pPr>
-      <w:r>
-        <w:rPr/>
-        <w:t xml:space="preserve">• </w:t>
-      </w:r>
-      <w:r>
-        <w:rPr>
-          <w:color w:val="7F7F7F"/>
-        </w:rPr>
-        <w:t>Experienced preprocessing chemical representation data and training deep learning models.</w:t>
-      </w:r>
-    </w:p>
-    <w:p>
-      <w:pPr/>
-      <w:r>
-        <w:rPr>
-          <w:b/>
-        </w:rPr>
-        <w:t>Decision Making Computational Modeling (sobdm-project)</w:t>
-      </w:r>
-    </w:p>
-    <w:p>
-      <w:pPr>
-        <w:ind w:firstLine="211"/>
-      </w:pPr>
-      <w:r>
-        <w:rPr/>
-        <w:t xml:space="preserve">• </w:t>
-      </w:r>
-      <w:r>
-        <w:rPr>
-          <w:color w:val="7F7F7F"/>
-        </w:rPr>
-        <w:t>Developed a reinforcement learning (Q-learning) fitting and simulation engine for 2-step decision making task data.</w:t>
-      </w:r>
-    </w:p>
-    <w:p>
-      <w:pPr>
-        <w:ind w:firstLine="211"/>
-      </w:pPr>
-      <w:r>
-        <w:rPr/>
-        <w:t xml:space="preserve">• </w:t>
-      </w:r>
-      <w:r>
-        <w:rPr>
-          <w:color w:val="7F7F7F"/>
-        </w:rPr>
-        <w:t>Experienced fitting behavioral data to cognitive models to quantify individual differences in decision making.</w:t>
-      </w:r>
-    </w:p>
-    <w:p>
-      <w:pPr/>
-      <w:r>
-        <w:rPr>
-          <w:b/>
-        </w:rPr>
-        <w:t>Magnolia (Magnolia)</w:t>
-      </w:r>
-    </w:p>
-    <w:p>
-      <w:pPr>
-        <w:ind w:firstLine="211"/>
-      </w:pPr>
-      <w:r>
-        <w:rPr/>
-        <w:t xml:space="preserve">• </w:t>
-      </w:r>
-      <w:r>
-        <w:rPr>
-          <w:color w:val="7F7F7F"/>
-        </w:rPr>
-        <w:t>Built a Python template pipeline for EEG and fMRI neural signal preprocessing and machine learning model training.</w:t>
-      </w:r>
-    </w:p>
-    <w:p>
-      <w:pPr>
-        <w:ind w:firstLine="211"/>
-      </w:pPr>
-      <w:r>
-        <w:rPr/>
-        <w:t xml:space="preserve">• </w:t>
-      </w:r>
-      <w:r>
-        <w:rPr>
-          <w:color w:val="7F7F7F"/>
-        </w:rPr>
-        <w:t>Streamlined data ingestion and feature extraction from complex neuroimaging formats.</w:t>
-      </w:r>
-    </w:p>
-    <w:p>
-      <w:pPr/>
-      <w:r>
-        <w:rPr>
-          <w:b/>
-        </w:rPr>
-        <w:t>Personal Website Development (junho.art)</w:t>
-      </w:r>
-    </w:p>
-    <w:p>
-      <w:pPr>
-        <w:ind w:firstLine="211"/>
-      </w:pPr>
-      <w:r>
-        <w:rPr/>
-        <w:t xml:space="preserve">• </w:t>
-      </w:r>
-      <w:r>
-        <w:rPr>
-          <w:color w:val="7F7F7F"/>
-        </w:rPr>
-        <w:t>Developed a responsive personal portfolio website from scratch using HTML, CSS, and JavaScript.</w:t>
-      </w:r>
-    </w:p>
     <w:p/>
+    <w:p>
+      <w:pPr>
+        <w:rPr>
+          <w:rFonts w:hint="eastAsia"/>
+        </w:rPr>
+      </w:pPr>
+    </w:p>
     <w:p>
       <w:pPr>
         <w:rPr>
@@ -1256,20 +1132,7 @@
         <w:rPr>
           <w:color w:val="7F7F7F" w:themeColor="text1" w:themeTint="80"/>
         </w:rPr>
-        <w:t xml:space="preserve">Fall </w:t>
-      </w:r>
-      <w:proofErr w:type="gramStart"/>
-      <w:r>
-        <w:rPr>
-          <w:color w:val="7F7F7F" w:themeColor="text1" w:themeTint="80"/>
-        </w:rPr>
-        <w:t>2023</w:t>
-      </w:r>
-      <w:r>
-        <w:rPr>
-          <w:color w:val="7F7F7F" w:themeColor="text1" w:themeTint="80"/>
-        </w:rPr>
-        <w:t xml:space="preserve">  </w:t>
+        <w:t xml:space="preserve">Fall 2023  </w:t>
       </w:r>
       <w:r>
         <w:rPr>
@@ -1277,24 +1140,7 @@
           <w:bCs/>
           <w:color w:val="000000" w:themeColor="text1"/>
         </w:rPr>
-        <w:t>Excellence</w:t>
-      </w:r>
-      <w:proofErr w:type="gramEnd"/>
-      <w:r>
-        <w:rPr>
-          <w:b/>
-          <w:bCs/>
-          <w:color w:val="000000" w:themeColor="text1"/>
-        </w:rPr>
-        <w:t xml:space="preserve"> Award</w:t>
-      </w:r>
-      <w:r>
-        <w:rPr>
-          <w:b/>
-          <w:bCs/>
-          <w:color w:val="000000" w:themeColor="text1"/>
-        </w:rPr>
-        <w:t xml:space="preserve">, </w:t>
+        <w:t xml:space="preserve">Excellence Award, </w:t>
       </w:r>
       <w:r>
         <w:rPr>
@@ -1310,23 +1156,13 @@
       <w:r>
         <w:t xml:space="preserve"> </w:t>
       </w:r>
-      <w:proofErr w:type="spellStart"/>
       <w:r>
         <w:rPr>
           <w:i/>
           <w:iCs/>
           <w:color w:val="86B37F"/>
         </w:rPr>
-        <w:t>Baekseok</w:t>
-      </w:r>
-      <w:proofErr w:type="spellEnd"/>
-      <w:r>
-        <w:rPr>
-          <w:i/>
-          <w:iCs/>
-          <w:color w:val="86B37F"/>
-        </w:rPr>
-        <w:t xml:space="preserve"> Univ.</w:t>
+        <w:t>Baekseok Univ.</w:t>
       </w:r>
       <w:bookmarkEnd w:id="0"/>
     </w:p>
@@ -1356,14 +1192,12 @@
     <w:p>
       <w:pPr>
         <w:tabs>
-          <w:tab w:pos="9029" w:val="right"/>
+          <w:tab w:val="right" w:pos="9029"/>
         </w:tabs>
         <w:ind w:firstLine="211"/>
       </w:pPr>
-      <w:r/>
-      <w:r>
-        <w:rPr>
-          <w:b w:val="0"/>
+      <w:r>
+        <w:rPr>
           <w:color w:val="7F7F7F"/>
         </w:rPr>
         <w:t xml:space="preserve">Spring 2026  </w:t>
@@ -1380,7 +1214,6 @@
       </w:r>
       <w:r>
         <w:rPr>
-          <w:b w:val="0"/>
           <w:i/>
           <w:color w:val="86B37F"/>
         </w:rPr>
@@ -1390,14 +1223,12 @@
     <w:p>
       <w:pPr>
         <w:tabs>
-          <w:tab w:pos="9029" w:val="right"/>
+          <w:tab w:val="right" w:pos="9029"/>
         </w:tabs>
         <w:ind w:firstLine="211"/>
       </w:pPr>
-      <w:r/>
-      <w:r>
-        <w:rPr>
-          <w:b w:val="0"/>
+      <w:r>
+        <w:rPr>
           <w:color w:val="7F7F7F"/>
         </w:rPr>
         <w:t xml:space="preserve">Fall 2025  </w:t>
@@ -1414,7 +1245,6 @@
       </w:r>
       <w:r>
         <w:rPr>
-          <w:b w:val="0"/>
           <w:i/>
           <w:color w:val="86B37F"/>
         </w:rPr>
@@ -1424,7 +1254,7 @@
     <w:p>
       <w:pPr>
         <w:tabs>
-          <w:tab w:pos="9029" w:val="right"/>
+          <w:tab w:val="right" w:pos="9029"/>
         </w:tabs>
         <w:ind w:firstLineChars="100" w:firstLine="211"/>
         <w:rPr>
@@ -1433,10 +1263,8 @@
           <w:color w:val="7F7F7F" w:themeColor="text1" w:themeTint="80"/>
         </w:rPr>
       </w:pPr>
-      <w:r/>
-      <w:r>
-        <w:rPr>
-          <w:b w:val="0"/>
+      <w:r>
+        <w:rPr>
           <w:color w:val="7F7F7F"/>
         </w:rPr>
         <w:t xml:space="preserve">Spring 2024  </w:t>
@@ -1453,7 +1281,6 @@
       </w:r>
       <w:r>
         <w:rPr>
-          <w:b w:val="0"/>
           <w:i/>
           <w:color w:val="86B37F"/>
         </w:rPr>
@@ -1463,7 +1290,7 @@
     <w:p>
       <w:pPr>
         <w:tabs>
-          <w:tab w:pos="9029" w:val="right"/>
+          <w:tab w:val="right" w:pos="9029"/>
         </w:tabs>
         <w:ind w:firstLineChars="100" w:firstLine="211"/>
         <w:rPr>
@@ -1472,10 +1299,8 @@
           <w:color w:val="7F7F7F" w:themeColor="text1" w:themeTint="80"/>
         </w:rPr>
       </w:pPr>
-      <w:r/>
-      <w:r>
-        <w:rPr>
-          <w:b w:val="0"/>
+      <w:r>
+        <w:rPr>
           <w:color w:val="7F7F7F"/>
         </w:rPr>
         <w:t xml:space="preserve">Spring 2021  </w:t>
@@ -1492,7 +1317,6 @@
       </w:r>
       <w:r>
         <w:rPr>
-          <w:b w:val="0"/>
           <w:i/>
           <w:color w:val="86B37F"/>
         </w:rPr>
@@ -1704,37 +1528,11 @@
           <w:color w:val="7F7F7F" w:themeColor="text1" w:themeTint="80"/>
         </w:rPr>
         <w:t>Daegu Digital Innovation Promotion Agency (DIP)</w:t>
-      </w:r>
-      <w:r>
-        <w:rPr>
-          <w:color w:val="7F7F7F" w:themeColor="text1" w:themeTint="80"/>
-        </w:rPr>
         <w:tab/>
-      </w:r>
-      <w:r>
-        <w:rPr>
-          <w:color w:val="7F7F7F" w:themeColor="text1" w:themeTint="80"/>
-        </w:rPr>
         <w:tab/>
-      </w:r>
-      <w:r>
-        <w:rPr>
-          <w:color w:val="7F7F7F" w:themeColor="text1" w:themeTint="80"/>
-        </w:rPr>
         <w:tab/>
-      </w:r>
-      <w:r>
-        <w:rPr>
-          <w:color w:val="7F7F7F" w:themeColor="text1" w:themeTint="80"/>
-        </w:rPr>
         <w:tab/>
-        <w:t xml:space="preserve">       </w:t>
-      </w:r>
-      <w:r>
-        <w:rPr>
-          <w:color w:val="7F7F7F" w:themeColor="text1" w:themeTint="80"/>
-        </w:rPr>
-        <w:t xml:space="preserve"> </w:t>
+        <w:t xml:space="preserve">        </w:t>
       </w:r>
       <w:r>
         <w:rPr>
@@ -1901,17 +1699,7 @@
           <w:color w:val="000000" w:themeColor="text1"/>
           <w:szCs w:val="20"/>
         </w:rPr>
-        <w:t>Programming</w:t>
-      </w:r>
-      <w:r>
-        <w:rPr>
-          <w:rFonts w:cs="Times New Roman"/>
-          <w:b/>
-          <w:bCs/>
-          <w:color w:val="000000" w:themeColor="text1"/>
-          <w:szCs w:val="20"/>
-        </w:rPr>
-        <w:t xml:space="preserve"> </w:t>
+        <w:t xml:space="preserve">Programming </w:t>
       </w:r>
       <w:r>
         <w:rPr>
@@ -1927,44 +1715,65 @@
           <w:color w:val="7F7F7F" w:themeColor="text1" w:themeTint="80"/>
           <w:szCs w:val="20"/>
         </w:rPr>
-        <w:t>Python, JavaScript, HTML/CSS</w:t>
-      </w:r>
-      <w:r>
+        <w:t>Python, JavaScript, HTML/CSS, php</w:t>
+      </w:r>
+    </w:p>
+    <w:p>
+      <w:pPr>
         <w:rPr>
           <w:rFonts w:cs="Times New Roman"/>
           <w:color w:val="7F7F7F" w:themeColor="text1" w:themeTint="80"/>
           <w:szCs w:val="20"/>
         </w:rPr>
-        <w:t xml:space="preserve">, </w:t>
-      </w:r>
-      <w:proofErr w:type="spellStart"/>
+      </w:pPr>
+      <w:r>
+        <w:rPr>
+          <w:rFonts w:cs="Times New Roman"/>
+          <w:b/>
+          <w:bCs/>
+          <w:color w:val="000000" w:themeColor="text1"/>
+          <w:szCs w:val="20"/>
+        </w:rPr>
+        <w:t xml:space="preserve">Machine Learning  </w:t>
+      </w:r>
       <w:r>
         <w:rPr>
           <w:rFonts w:cs="Times New Roman"/>
           <w:color w:val="7F7F7F" w:themeColor="text1" w:themeTint="80"/>
           <w:szCs w:val="20"/>
         </w:rPr>
-        <w:t>p</w:t>
-      </w:r>
-      <w:r>
+        <w:t>Scikit-learn-learn</w:t>
+      </w:r>
+    </w:p>
+    <w:p>
+      <w:pPr>
         <w:rPr>
           <w:rFonts w:cs="Times New Roman"/>
           <w:color w:val="7F7F7F" w:themeColor="text1" w:themeTint="80"/>
           <w:szCs w:val="20"/>
         </w:rPr>
-        <w:t>hp</w:t>
-      </w:r>
-      <w:proofErr w:type="spellEnd"/>
-    </w:p>
-    <w:p>
-      <w:pPr>
+      </w:pPr>
+      <w:r>
+        <w:rPr>
+          <w:rFonts w:cs="Times New Roman"/>
+          <w:b/>
+          <w:bCs/>
+          <w:color w:val="000000" w:themeColor="text1"/>
+          <w:szCs w:val="20"/>
+        </w:rPr>
+        <w:t xml:space="preserve">Deep Learning     </w:t>
+      </w:r>
+      <w:r>
         <w:rPr>
           <w:rFonts w:cs="Times New Roman"/>
           <w:color w:val="7F7F7F" w:themeColor="text1" w:themeTint="80"/>
           <w:szCs w:val="20"/>
         </w:rPr>
-      </w:pPr>
-      <w:r>
+        <w:t>PyTorch</w:t>
+      </w:r>
+    </w:p>
+    <w:p>
+      <w:pPr>
         <w:rPr>
           <w:rFonts w:cs="Times New Roman"/>
           <w:b/>
@@ -1972,8 +1781,7 @@
           <w:color w:val="000000" w:themeColor="text1"/>
           <w:szCs w:val="20"/>
         </w:rPr>
-        <w:t>Machine Learning</w:t>
-      </w:r>
+      </w:pPr>
       <w:r>
         <w:rPr>
           <w:rFonts w:cs="Times New Roman"/>
@@ -1982,144 +1790,36 @@
           <w:color w:val="000000" w:themeColor="text1"/>
           <w:szCs w:val="20"/>
         </w:rPr>
-        <w:t xml:space="preserve">  </w:t>
-      </w:r>
-      <w:proofErr w:type="spellStart"/>
+        <w:t>Data Analysis</w:t>
+      </w:r>
+      <w:r>
+        <w:rPr>
+          <w:rFonts w:cs="Times New Roman" w:hint="eastAsia"/>
+          <w:b/>
+          <w:bCs/>
+          <w:color w:val="000000" w:themeColor="text1"/>
+          <w:szCs w:val="20"/>
+        </w:rPr>
+        <w:t xml:space="preserve"> </w:t>
+      </w:r>
+      <w:r>
+        <w:rPr>
+          <w:rFonts w:cs="Times New Roman"/>
+          <w:b/>
+          <w:bCs/>
+          <w:color w:val="000000" w:themeColor="text1"/>
+          <w:szCs w:val="20"/>
+        </w:rPr>
+        <w:t xml:space="preserve">     </w:t>
+      </w:r>
       <w:r>
         <w:rPr>
           <w:rFonts w:cs="Times New Roman"/>
           <w:color w:val="7F7F7F" w:themeColor="text1" w:themeTint="80"/>
           <w:szCs w:val="20"/>
         </w:rPr>
-        <w:t>Scikit-learn</w:t>
-      </w:r>
-      <w:proofErr w:type="spellEnd"/>
-      <w:r>
-        <w:rPr>
-          <w:rFonts w:cs="Times New Roman"/>
-          <w:color w:val="7F7F7F" w:themeColor="text1" w:themeTint="80"/>
-          <w:szCs w:val="20"/>
-        </w:rPr>
-        <w:t>-learn</w:t>
-      </w:r>
-    </w:p>
-    <w:p>
-      <w:pPr>
-        <w:rPr>
-          <w:rFonts w:cs="Times New Roman"/>
-          <w:color w:val="7F7F7F" w:themeColor="text1" w:themeTint="80"/>
-          <w:szCs w:val="20"/>
-        </w:rPr>
-      </w:pPr>
-      <w:r>
-        <w:rPr>
-          <w:rFonts w:cs="Times New Roman"/>
-          <w:b/>
-          <w:bCs/>
-          <w:color w:val="000000" w:themeColor="text1"/>
-          <w:szCs w:val="20"/>
-        </w:rPr>
-        <w:t>Deep Learning</w:t>
-      </w:r>
-      <w:r>
-        <w:rPr>
-          <w:rFonts w:cs="Times New Roman"/>
-          <w:b/>
-          <w:bCs/>
-          <w:color w:val="000000" w:themeColor="text1"/>
-          <w:szCs w:val="20"/>
-        </w:rPr>
-        <w:t xml:space="preserve">     </w:t>
-      </w:r>
-      <w:r>
-        <w:rPr>
-          <w:rFonts w:cs="Times New Roman"/>
-          <w:color w:val="7F7F7F" w:themeColor="text1" w:themeTint="80"/>
-          <w:szCs w:val="20"/>
-        </w:rPr>
-        <w:t>PyTorch</w:t>
-      </w:r>
-    </w:p>
-    <w:p>
-      <w:pPr>
-        <w:rPr>
-          <w:rFonts w:cs="Times New Roman"/>
-          <w:b/>
-          <w:bCs/>
-          <w:color w:val="000000" w:themeColor="text1"/>
-          <w:szCs w:val="20"/>
-        </w:rPr>
-      </w:pPr>
-      <w:r>
-        <w:rPr>
-          <w:rFonts w:cs="Times New Roman"/>
-          <w:b/>
-          <w:bCs/>
-          <w:color w:val="000000" w:themeColor="text1"/>
-          <w:szCs w:val="20"/>
-        </w:rPr>
-        <w:t>Data Analysis</w:t>
-      </w:r>
-      <w:r>
-        <w:rPr>
-          <w:rFonts w:cs="Times New Roman" w:hint="eastAsia"/>
-          <w:b/>
-          <w:bCs/>
-          <w:color w:val="000000" w:themeColor="text1"/>
-          <w:szCs w:val="20"/>
-        </w:rPr>
-        <w:t xml:space="preserve"> </w:t>
-      </w:r>
-      <w:r>
-        <w:rPr>
-          <w:rFonts w:cs="Times New Roman"/>
-          <w:b/>
-          <w:bCs/>
-          <w:color w:val="000000" w:themeColor="text1"/>
-          <w:szCs w:val="20"/>
-        </w:rPr>
-        <w:t xml:space="preserve">     </w:t>
-      </w:r>
-      <w:proofErr w:type="spellStart"/>
-      <w:r>
-        <w:rPr>
-          <w:rFonts w:cs="Times New Roman"/>
-          <w:color w:val="7F7F7F" w:themeColor="text1" w:themeTint="80"/>
-          <w:szCs w:val="20"/>
-        </w:rPr>
         <w:t>NumPy, Pandas, SciPy</w:t>
       </w:r>
-      <w:r>
-        <w:rPr>
-          <w:rFonts w:cs="Times New Roman"/>
-          <w:color w:val="7F7F7F" w:themeColor="text1" w:themeTint="80"/>
-          <w:szCs w:val="20"/>
-        </w:rPr>
-      </w:r>
-      <w:proofErr w:type="spellEnd"/>
-      <w:r>
-        <w:rPr>
-          <w:rFonts w:cs="Times New Roman"/>
-          <w:color w:val="7F7F7F" w:themeColor="text1" w:themeTint="80"/>
-          <w:szCs w:val="20"/>
-        </w:rPr>
-      </w:r>
-      <w:r>
-        <w:rPr>
-          <w:rFonts w:cs="Times New Roman"/>
-          <w:color w:val="7F7F7F" w:themeColor="text1" w:themeTint="80"/>
-          <w:szCs w:val="20"/>
-        </w:rPr>
-      </w:r>
-      <w:proofErr w:type="spellStart"/>
-      <w:r>
-        <w:rPr>
-          <w:rFonts w:cs="Times New Roman"/>
-          <w:color w:val="7F7F7F" w:themeColor="text1" w:themeTint="80"/>
-          <w:szCs w:val="20"/>
-        </w:rPr>
-      </w:r>
-      <w:proofErr w:type="spellEnd"/>
       <w:r>
         <w:rPr>
           <w:rFonts w:cs="Times New Roman" w:hint="eastAsia"/>

</xml_diff>

<commit_message>
chore: clean up directory structure
- Replace Junho_Heo_CV.docx with updated HeoJunho_CV.docx
- Rename favicon_io/ to favicon/ and update all HTML references
- Remove Word HTML export artifacts (Junho_Heo_CV.fld, Junho_Heo_CV.html)
- Remove nginx default page, backup_original/, and projects_revised.md

Co-Authored-By: Claude Sonnet 4.6 <noreply@anthropic.com>
</commit_message>
<xml_diff>
--- a/Junho_Heo_CV.docx
+++ b/Junho_Heo_CV.docx
@@ -342,7 +342,7 @@
                 <v:stroke joinstyle="miter"/>
                 <v:path gradientshapeok="t" o:connecttype="rect"/>
               </v:shapetype>
-              <v:shape id="Text Box 4" o:spid="_x0000_s1026" type="#_x0000_t202" style="position:absolute;margin-left:107.1pt;margin-top:6.3pt;width:354.7pt;height:96.4pt;z-index:251660288;visibility:visible;mso-wrap-style:square;mso-width-percent:0;mso-height-percent:0;mso-wrap-distance-left:9pt;mso-wrap-distance-top:0;mso-wrap-distance-right:9pt;mso-wrap-distance-bottom:0;mso-position-horizontal:absolute;mso-position-horizontal-relative:text;mso-position-vertical:absolute;mso-position-vertical-relative:text;mso-width-percent:0;mso-height-percent:0;mso-width-relative:margin;mso-height-relative:margin;v-text-anchor:top" o:gfxdata="UEsDBBQABgAIAAAAIQC2gziS/gAAAOEBAAATAAAAW0NvbnRlbnRfVHlwZXNdLnhtbJSRQU7DMBBF 90jcwfIWJU67QAgl6YK0S0CoHGBkTxKLZGx5TGhvj5O2G0SRWNoz/78nu9wcxkFMGNg6quQqL6RA 0s5Y6ir5vt9lD1JwBDIwOMJKHpHlpr69KfdHjyxSmriSfYz+USnWPY7AufNIadK6MEJMx9ApD/oD OlTrorhX2lFEilmcO2RdNtjC5xDF9pCuTyYBB5bi6bQ4syoJ3g9WQ0ymaiLzg5KdCXlKLjvcW893 SUOqXwnz5DrgnHtJTxOsQfEKIT7DmDSUCaxw7Rqn8787ZsmRM9e2VmPeBN4uqYvTtW7jvijg9N/y JsXecLq0q+WD6m8AAAD//wMAUEsDBBQABgAIAAAAIQA4/SH/1gAAAJQBAAALAAAAX3JlbHMvLnJl bHOkkMFqwzAMhu+DvYPRfXGawxijTi+j0GvpHsDYimMaW0Yy2fr2M4PBMnrbUb/Q94l/f/hMi1qR JVI2sOt6UJgd+ZiDgffL8ekFlFSbvV0oo4EbChzGx4f9GRdb25HMsYhqlCwG5lrLq9biZkxWOiqY 22YiTra2kYMu1l1tQD30/bPm3wwYN0x18gb45AdQl1tp5j/sFB2T0FQ7R0nTNEV3j6o9feQzro1i OWA14Fm+Q8a1a8+Bvu/d/dMb2JY5uiPbhG/ktn4cqGU/er3pcvwCAAD//wMAUEsDBBQABgAIAAAA IQBzDQr2GQIAAC0EAAAOAAAAZHJzL2Uyb0RvYy54bWysU11v2yAUfZ+0/4B4b+ykTpdacaqsVaZJ UVspnfpMMMSWMJcBiZ39+l2w86FuT9Ne4MK93I9zDvOHrlHkIKyrQRd0PEopEZpDWetdQX+8rW5m lDjPdMkUaFHQo3D0YfH507w1uZhABaoUlmAS7fLWFLTy3uRJ4nglGuZGYIRGpwTbMI9Hu0tKy1rM 3qhkkqZ3SQu2NBa4cA5vn3onXcT8UgruX6R0whNVUOzNx9XGdRvWZDFn+c4yU9V8aIP9QxcNqzUW Pad6Yp6Rva3/SNXU3IID6UccmgSkrLmIM+A04/TDNJuKGRFnQXCcOcPk/l9a/nzYmFdLfPcVOiQw ANIalzu8DPN00jZhx04J+hHC4xk20XnC8TKbptlsdk8JR994MsnSNAKbXJ4b6/w3AQ0JRkEt8hLh Yoe181gSQ08hoZqGVa1U5EZp0hb07naaxgdnD75QGh9emg2W77bdMMEWyiMOZqHn3Bm+qrH4mjn/ yiySjLOgcP0LLlIBFoHBoqQC++tv9yEesUcvJS2KpqDu555ZQYn6rpGV+3GWBZXFQzb9MsGDvfZs rz163zwC6nKMX8TwaIZ4r06mtNC8o76XoSq6mOZYu6D+ZD76Xsr4P7hYLmMQ6sowv9Ybw0PqAGeA 9q17Z9YM+Huk7hlO8mL5Bxr62J6I5d6DrCNHAeAe1QF31GSkbvg/QfTX5xh1+eWL3wAAAP//AwBQ SwMEFAAGAAgAAAAhACwuvUvjAAAADwEAAA8AAABkcnMvZG93bnJldi54bWxMT01PwzAMvSPxHyIj cWPpwjaNruk0FU1ICA4bu3BzG6+taJLSZFvh12NOcLFsvef3ka1H24kzDaH1TsN0koAgV3nTulrD 4W17twQRIjqDnXek4YsCrPPrqwxT4y9uR+d9rAWLuJCihibGPpUyVA1ZDBPfk2Ps6AeLkc+hlmbA C4vbTqokWUiLrWOHBnsqGqo+9ier4bnYvuKuVHb53RVPL8dN/3l4n2t9ezM+rnhsViAijfHvA347 cH7IOVjpT84E0WlQ05liKgNqAYIJD+qel5KRZD4DmWfyf4/8BwAA//8DAFBLAQItABQABgAIAAAA IQC2gziS/gAAAOEBAAATAAAAAAAAAAAAAAAAAAAAAABbQ29udGVudF9UeXBlc10ueG1sUEsBAi0A FAAGAAgAAAAhADj9If/WAAAAlAEAAAsAAAAAAAAAAAAAAAAALwEAAF9yZWxzLy5yZWxzUEsBAi0A FAAGAAgAAAAhAHMNCvYZAgAALQQAAA4AAAAAAAAAAAAAAAAALgIAAGRycy9lMm9Eb2MueG1sUEsB Ai0AFAAGAAgAAAAhACwuvUvjAAAADwEAAA8AAAAAAAAAAAAAAAAAcwQAAGRycy9kb3ducmV2Lnht bFBLBQYAAAAABAAEAPMAAACDBQAAAAA= " filled="f" stroked="f" strokeweight=".5pt">
+              <v:shape id="Text Box 4" o:spid="_x0000_s1026" type="#_x0000_t202" style="position:absolute;margin-left:107.1pt;margin-top:6.3pt;width:354.7pt;height:96.4pt;z-index:251660288;visibility:visible;mso-wrap-style:square;mso-width-percent:0;mso-height-percent:0;mso-wrap-distance-left:9pt;mso-wrap-distance-top:0;mso-wrap-distance-right:9pt;mso-wrap-distance-bottom:0;mso-position-horizontal:absolute;mso-position-horizontal-relative:text;mso-position-vertical:absolute;mso-position-vertical-relative:text;mso-width-percent:0;mso-height-percent:0;mso-width-relative:margin;mso-height-relative:margin;v-text-anchor:top" o:gfxdata="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" filled="f" stroked="f" strokeweight=".5pt">
                 <v:textbox>
                   <w:txbxContent>
                     <w:p>
@@ -400,7 +400,7 @@
                             <w16se:symEx w16se:font="Monoplex KR Nerd" w16se:char="1F4DE"/>
                           </mc:Choice>
                           <mc:Fallback>
-                            <w:t>☎</w:t>
+                            <w:t>📞</w:t>
                           </mc:Fallback>
                         </mc:AlternateContent>
                       </w:r>
@@ -473,7 +473,7 @@
                             <w16se:symEx w16se:font="Monoplex KR Nerd" w16se:char="1F3E0"/>
                           </mc:Choice>
                           <mc:Fallback>
-                            <w:t>⌂</w:t>
+                            <w:t>🏠</w:t>
                           </mc:Fallback>
                         </mc:AlternateContent>
                       </w:r>
@@ -522,7 +522,7 @@
                             <w16se:symEx w16se:font="Monoplex KR Nerd" w16se:char="1F4DD"/>
                           </mc:Choice>
                           <mc:Fallback>
-                            <w:t>✎</w:t>
+                            <w:t>📝</w:t>
                           </mc:Fallback>
                         </mc:AlternateContent>
                       </w:r>
@@ -756,6 +756,380 @@
     </w:p>
     <w:p>
       <w:pPr>
+        <w:tabs>
+          <w:tab w:val="left" w:pos="5007"/>
+        </w:tabs>
+        <w:rPr>
+          <w:rFonts w:ascii="Monoplex KR Nerd" w:hAnsi="Monoplex KR Nerd"/>
+          <w:b/>
+          <w:bCs/>
+          <w:color w:val="C0FFB6"/>
+          <w:sz w:val="36"/>
+          <w:szCs w:val="40"/>
+        </w:rPr>
+      </w:pPr>
+      <w:r>
+        <w:rPr>
+          <w:rFonts w:ascii="Monoplex KR Nerd" w:hAnsi="Monoplex KR Nerd"/>
+          <w:b/>
+          <w:bCs/>
+          <w:noProof/>
+          <w:color w:val="86B37F"/>
+          <w:sz w:val="36"/>
+          <w:szCs w:val="40"/>
+        </w:rPr>
+        <mc:AlternateContent>
+          <mc:Choice Requires="wps">
+            <w:drawing>
+              <wp:anchor distT="0" distB="0" distL="114300" distR="114300" simplePos="0" relativeHeight="251710001" behindDoc="0" locked="0" layoutInCell="1" allowOverlap="1" wp14:anchorId="4A1B2C01" wp14:editId="7E9D1B58">
+                <wp:simplePos x="0" y="0"/>
+                <wp:positionH relativeFrom="column">
+                  <wp:posOffset>0</wp:posOffset>
+                </wp:positionH>
+                <wp:positionV relativeFrom="paragraph">
+                  <wp:posOffset>304800</wp:posOffset>
+                </wp:positionV>
+                <wp:extent cx="5733415" cy="0"/>
+                <wp:effectExtent l="0" t="0" r="6985" b="12700"/>
+                <wp:wrapNone/>
+                <wp:docPr id="1995000001" name="직선 연결선[R] 3"/>
+                <wp:cNvGraphicFramePr/>
+                <a:graphic xmlns:a="http://schemas.openxmlformats.org/drawingml/2006/main">
+                  <a:graphicData uri="http://schemas.microsoft.com/office/word/2010/wordprocessingShape">
+                    <wps:wsp>
+                      <wps:cNvCnPr/>
+                      <wps:spPr>
+                        <a:xfrm>
+                          <a:off x="0" y="0"/>
+                          <a:ext cx="5733415" cy="0"/>
+                        </a:xfrm>
+                        <a:prstGeom prst="line">
+                          <a:avLst/>
+                        </a:prstGeom>
+                        <a:ln w="15875">
+                          <a:solidFill>
+                            <a:schemeClr val="tx1">
+                              <a:lumMod val="65000"/>
+                              <a:lumOff val="35000"/>
+                            </a:schemeClr>
+                          </a:solidFill>
+                        </a:ln>
+                      </wps:spPr>
+                      <wps:style>
+                        <a:lnRef idx="1">
+                          <a:schemeClr val="accent1"/>
+                        </a:lnRef>
+                        <a:fillRef idx="0">
+                          <a:schemeClr val="accent1"/>
+                        </a:fillRef>
+                        <a:effectRef idx="0">
+                          <a:schemeClr val="accent1"/>
+                        </a:effectRef>
+                        <a:fontRef idx="minor">
+                          <a:schemeClr val="tx1"/>
+                        </a:fontRef>
+                      </wps:style>
+                      <wps:bodyPr/>
+                    </wps:wsp>
+                  </a:graphicData>
+                </a:graphic>
+                <wp14:sizeRelH relativeFrom="margin">
+                  <wp14:pctWidth>0</wp14:pctWidth>
+                </wp14:sizeRelH>
+              </wp:anchor>
+            </w:drawing>
+          </mc:Choice>
+          <mc:Fallback>
+            <w:pict>
+              <v:line w14:anchorId="4A1B2C01" id="0F348FCBL" o:spid="_x0000_s1101" style="position:absolute;z-index:251710001;visibility:visible;mso-wrap-style:square;mso-width-percent:0;mso-wrap-distance-left:9pt;mso-wrap-distance-top:0;mso-wrap-distance-right:9pt;mso-wrap-distance-bottom:0;mso-position-horizontal:absolute;mso-position-horizontal-relative:text;mso-position-vertical:absolute;mso-position-vertical-relative:text;mso-width-percent:0;mso-width-relative:margin" from="0pt,24pt" to="451.45pt,24pt" o:gfxdata="UEsDBBQABgAIAAAAIQC2gziS/gAAAOEBAAATAAAAW0NvbnRlbnRfVHlwZXNdLnhtbJSRQU7DMBBF 90jcwfIWJU67QAgl6YK0S0CoHGBkTxKLZGx5TGhvj5O2G0SRWNoz/78nu9wcxkFMGNg6quQqL6RA 0s5Y6ir5vt9lD1JwBDIwOMJKHpHlpr69KfdHjyxSmriSfYz+USnWPY7AufNIadK6MEJMx9ApD/oD OlTrorhX2lFEilmcO2RdNtjC5xDF9pCuTyYBB5bi6bQ4syoJ3g9WQ0ymaiLzg5KdCXlKLjvcW893 SUOqXwnz5DrgnHtJTxOsQfEKIT7DmDSUCaxw7Rqn8787ZsmRM9e2VmPeBN4uqYvTtW7jvijg9N/y JsXecLq0q+WD6m8AAAD//wMAUEsDBBQABgAIAAAAIQA4/SH/1gAAAJQBAAALAAAAX3JlbHMvLnJl bHOkkMFqwzAMhu+DvYPRfXGawxijTi+j0GvpHsDYimMaW0Yy2fr2M4PBMnrbUb/Q94l/f/hMi1qR JVI2sOt6UJgd+ZiDgffL8ekFlFSbvV0oo4EbChzGx4f9GRdb25HMsYhqlCwG5lrLq9biZkxWOiqY 22YiTra2kYMu1l1tQD30/bPm3wwYN0x18gb45AdQl1tp5j/sFB2T0FQ7R0nTNEV3j6o9feQzro1i OWA14Fm+Q8a1a8+Bvu/d/dMb2JY5uiPbhG/ktn4cqGU/er3pcvwCAAD//wMAUEsDBBQABgAIAAAA IQDBp8dN2gEAABkEAAAOAAAAZHJzL2Uyb0RvYy54bWysU8tu2zAQvBfoPxC8x5Kc2k0FyzkkSC99 BEn6AQy1tAjwBZKx5L/vkrTlpO2lRS+UtLszs7Ncba4nrcgefJDWdLRZ1JSA4baXZtfRH093F1eU hMhMz5Q10NEDBHq9ff9uM7oWlnawqgdPkMSEdnQdHWJ0bVUFPoBmYWEdGEwK6zWL+Ol3Ve/ZiOxa Vcu6Xlej9b3zlkMIGL0tSbrN/EIAj9+FCBCJ6ij2FvPp8/mczmq7Ye3OMzdIfmyD/UMXmkmDojPV LYuMvHj5G5WW3NtgRVxwqysrhOSQPaCbpv7FzePAHGQvOJzg5jGF/0fLv+1vzL3HMYwutMHd++Ri El6nJ/ZHpjyswzwsmCLhGPyw/rS8bNaU8FOuOgOdD/EzWE3SS0eVNMkHa9n+S4gohqWnkhRWhoy4 Paurj6tcFqyS/Z1UKiXzLsCN8mTP8Bbj1OQa9aK/2r7E1qu6Pt4lhvHGS/jyFEa5mSWLvxLAnDIY PPvPb/GgoLT2AILIHh0X3ZmoaDDOwcQmLVJmwuoEE9j8DKyLqbTTZx9vgcf6BIW8tn8DnhFZ2Zo4 g7U01v9JPU2xtCxK/WkCxXcawbPtD3kz8mhw/7LD47+SFvz1d4af/+jtTwAAAP//AwBQSwMEFAAG AAgAAAAhAJHUi/riAAAADgEAAA8AAABkcnMvZG93bnJldi54bWxMj09Pg0AQxe8mfofNmHizS9VC pSxNU2M4GtFEj1t2BJSdRXah6Kd3jAe9TPLmz5vfy7az7cSEg28dKVguIhBIlTMt1QqeHu8u1iB8 0GR05wgVfKKHbX56kunUuCM94FSGWrAJ+VQraELoUyl91aDVfuF6JJ69usHqwHKopRn0kc1tJy+j KJZWt8QfGt3jvsHqvRytgnksi/WHb6d7+tq/7OqkuH4rnpU6P5tvN1x2GxAB5/B3AT8ZmB9yBju4 kYwXHeskZv6g4CpegeCFm+UqAXH4bcg8k/9j5N8AAAD//wMAUEsBAi0AFAAGAAgAAAAhALaDOJL+ AAAA4QEAABMAAAAAAAAAAAAAAAAAAAAAAFtDb250ZW50X1R5cGVzXS54bWxQSwECLQAUAAYACAAA ACEAOP0h/9YAAACUAQAACwAAAAAAAAAAAAAAAAAvAQAAX3JlbHMvLnJlbHNQSwECLQAUAAYACAAA ACEAwafHTdoBAAAZBAAADgAAAAAAAAAAAAAAAAAuAgAAZHJzL2Uyb0RvYy54bWxQSwECLQAUAAYA CAAAACEAkdSL+uIAAAAOAQAADwAAAAAAAAAAAAAAAAA0BAAAZHJzL2Rvd25yZXYueG1sUEsFBgAA AAAEAAQA8wAAAEMFAAAAAA== " strokecolor="#5a5a5a [2109]" strokeweight="1.25pt">
+                <v:stroke joinstyle="miter"/>
+              </v:line>
+            </w:pict>
+          </mc:Fallback>
+        </mc:AlternateContent>
+      </w:r>
+      <w:r>
+        <w:rPr>
+          <w:rFonts w:ascii="Monoplex KR Nerd" w:hAnsi="Monoplex KR Nerd"/>
+          <w:b/>
+          <w:bCs/>
+          <w:color w:val="86B37F"/>
+          <w:sz w:val="36"/>
+          <w:szCs w:val="40"/>
+        </w:rPr>
+        <w:t>R</w:t>
+      </w:r>
+      <w:r>
+        <w:rPr>
+          <w:rFonts w:ascii="Monoplex KR Nerd" w:hAnsi="Monoplex KR Nerd"/>
+          <w:b/>
+          <w:bCs/>
+          <w:sz w:val="36"/>
+          <w:szCs w:val="40"/>
+        </w:rPr>
+        <w:t xml:space="preserve">esearch </w:t>
+      </w:r>
+      <w:r>
+        <w:rPr>
+          <w:rFonts w:ascii="Monoplex KR Nerd" w:hAnsi="Monoplex KR Nerd"/>
+          <w:b/>
+          <w:bCs/>
+          <w:color w:val="86B37F"/>
+          <w:sz w:val="36"/>
+          <w:szCs w:val="40"/>
+        </w:rPr>
+        <w:t>I</w:t>
+      </w:r>
+      <w:r>
+        <w:rPr>
+          <w:rFonts w:ascii="Monoplex KR Nerd" w:hAnsi="Monoplex KR Nerd"/>
+          <w:b/>
+          <w:bCs/>
+          <w:sz w:val="36"/>
+          <w:szCs w:val="40"/>
+        </w:rPr>
+        <w:t>nterests</w:t>
+      </w:r>
+    </w:p>
+    <w:p>
+      <w:pPr>
+        <w:rPr>
+          <w:color w:val="7F7F7F"/>
+        </w:rPr>
+      </w:pPr>
+    </w:p>
+    <w:p>
+      <w:r>
+        <w:rPr>
+          <w:color w:val="7F7F7F"/>
+        </w:rPr>
+        <w:t>Computational Neuroscience · Reinforcement Learning and Decision-Making · Behavioral and Neural Data Analysis · Computational Psychiatry</w:t>
+      </w:r>
+    </w:p>
+    <w:p>
+      <w:pPr>
+        <w:rPr>
+          <w:b/>
+          <w:bCs/>
+          <w:szCs w:val="20"/>
+        </w:rPr>
+      </w:pPr>
+    </w:p>
+    <w:p>
+      <w:pPr>
+        <w:tabs>
+          <w:tab w:val="left" w:pos="5007"/>
+        </w:tabs>
+        <w:rPr>
+          <w:rFonts w:ascii="Monoplex KR Nerd" w:hAnsi="Monoplex KR Nerd"/>
+          <w:b/>
+          <w:bCs/>
+          <w:color w:val="C0FFB6"/>
+          <w:sz w:val="36"/>
+          <w:szCs w:val="40"/>
+        </w:rPr>
+      </w:pPr>
+      <w:r>
+        <w:rPr>
+          <w:rFonts w:ascii="Monoplex KR Nerd" w:hAnsi="Monoplex KR Nerd"/>
+          <w:b/>
+          <w:bCs/>
+          <w:noProof/>
+          <w:color w:val="86B37F"/>
+          <w:sz w:val="36"/>
+          <w:szCs w:val="40"/>
+        </w:rPr>
+        <mc:AlternateContent>
+          <mc:Choice Requires="wps">
+            <w:drawing>
+              <wp:anchor distT="0" distB="0" distL="114300" distR="114300" simplePos="0" relativeHeight="251710002" behindDoc="0" locked="0" layoutInCell="1" allowOverlap="1" wp14:anchorId="4A1B2C02" wp14:editId="7E9D1B58">
+                <wp:simplePos x="0" y="0"/>
+                <wp:positionH relativeFrom="column">
+                  <wp:posOffset>0</wp:posOffset>
+                </wp:positionH>
+                <wp:positionV relativeFrom="paragraph">
+                  <wp:posOffset>304800</wp:posOffset>
+                </wp:positionV>
+                <wp:extent cx="5733415" cy="0"/>
+                <wp:effectExtent l="0" t="0" r="6985" b="12700"/>
+                <wp:wrapNone/>
+                <wp:docPr id="1995000002" name="직선 연결선[R] 3"/>
+                <wp:cNvGraphicFramePr/>
+                <a:graphic xmlns:a="http://schemas.openxmlformats.org/drawingml/2006/main">
+                  <a:graphicData uri="http://schemas.microsoft.com/office/word/2010/wordprocessingShape">
+                    <wps:wsp>
+                      <wps:cNvCnPr/>
+                      <wps:spPr>
+                        <a:xfrm>
+                          <a:off x="0" y="0"/>
+                          <a:ext cx="5733415" cy="0"/>
+                        </a:xfrm>
+                        <a:prstGeom prst="line">
+                          <a:avLst/>
+                        </a:prstGeom>
+                        <a:ln w="15875">
+                          <a:solidFill>
+                            <a:schemeClr val="tx1">
+                              <a:lumMod val="65000"/>
+                              <a:lumOff val="35000"/>
+                            </a:schemeClr>
+                          </a:solidFill>
+                        </a:ln>
+                      </wps:spPr>
+                      <wps:style>
+                        <a:lnRef idx="1">
+                          <a:schemeClr val="accent1"/>
+                        </a:lnRef>
+                        <a:fillRef idx="0">
+                          <a:schemeClr val="accent1"/>
+                        </a:fillRef>
+                        <a:effectRef idx="0">
+                          <a:schemeClr val="accent1"/>
+                        </a:effectRef>
+                        <a:fontRef idx="minor">
+                          <a:schemeClr val="tx1"/>
+                        </a:fontRef>
+                      </wps:style>
+                      <wps:bodyPr/>
+                    </wps:wsp>
+                  </a:graphicData>
+                </a:graphic>
+                <wp14:sizeRelH relativeFrom="margin">
+                  <wp14:pctWidth>0</wp14:pctWidth>
+                </wp14:sizeRelH>
+              </wp:anchor>
+            </w:drawing>
+          </mc:Choice>
+          <mc:Fallback>
+            <w:pict>
+              <v:line w14:anchorId="4A1B2C02" id="5CFC8DB9L" o:spid="_x0000_s1102" style="position:absolute;z-index:251710002;visibility:visible;mso-wrap-style:square;mso-width-percent:0;mso-wrap-distance-left:9pt;mso-wrap-distance-top:0;mso-wrap-distance-right:9pt;mso-wrap-distance-bottom:0;mso-position-horizontal:absolute;mso-position-horizontal-relative:text;mso-position-vertical:absolute;mso-position-vertical-relative:text;mso-width-percent:0;mso-width-relative:margin" from="0pt,24pt" to="451.45pt,24pt" o:gfxdata="UEsDBBQABgAIAAAAIQC2gziS/gAAAOEBAAATAAAAW0NvbnRlbnRfVHlwZXNdLnhtbJSRQU7DMBBF 90jcwfIWJU67QAgl6YK0S0CoHGBkTxKLZGx5TGhvj5O2G0SRWNoz/78nu9wcxkFMGNg6quQqL6RA 0s5Y6ir5vt9lD1JwBDIwOMJKHpHlpr69KfdHjyxSmriSfYz+USnWPY7AufNIadK6MEJMx9ApD/oD OlTrorhX2lFEilmcO2RdNtjC5xDF9pCuTyYBB5bi6bQ4syoJ3g9WQ0ymaiLzg5KdCXlKLjvcW893 SUOqXwnz5DrgnHtJTxOsQfEKIT7DmDSUCaxw7Rqn8787ZsmRM9e2VmPeBN4uqYvTtW7jvijg9N/y JsXecLq0q+WD6m8AAAD//wMAUEsDBBQABgAIAAAAIQA4/SH/1gAAAJQBAAALAAAAX3JlbHMvLnJl bHOkkMFqwzAMhu+DvYPRfXGawxijTi+j0GvpHsDYimMaW0Yy2fr2M4PBMnrbUb/Q94l/f/hMi1qR JVI2sOt6UJgd+ZiDgffL8ekFlFSbvV0oo4EbChzGx4f9GRdb25HMsYhqlCwG5lrLq9biZkxWOiqY 22YiTra2kYMu1l1tQD30/bPm3wwYN0x18gb45AdQl1tp5j/sFB2T0FQ7R0nTNEV3j6o9feQzro1i OWA14Fm+Q8a1a8+Bvu/d/dMb2JY5uiPbhG/ktn4cqGU/er3pcvwCAAD//wMAUEsDBBQABgAIAAAA IQDBp8dN2gEAABkEAAAOAAAAZHJzL2Uyb0RvYy54bWysU8tu2zAQvBfoPxC8x5Kc2k0FyzkkSC99 BEn6AQy1tAjwBZKx5L/vkrTlpO2lRS+UtLszs7Ncba4nrcgefJDWdLRZ1JSA4baXZtfRH093F1eU hMhMz5Q10NEDBHq9ff9uM7oWlnawqgdPkMSEdnQdHWJ0bVUFPoBmYWEdGEwK6zWL+Ol3Ve/ZiOxa Vcu6Xlej9b3zlkMIGL0tSbrN/EIAj9+FCBCJ6ij2FvPp8/mczmq7Ye3OMzdIfmyD/UMXmkmDojPV LYuMvHj5G5WW3NtgRVxwqysrhOSQPaCbpv7FzePAHGQvOJzg5jGF/0fLv+1vzL3HMYwutMHd++Ri El6nJ/ZHpjyswzwsmCLhGPyw/rS8bNaU8FOuOgOdD/EzWE3SS0eVNMkHa9n+S4gohqWnkhRWhoy4 Paurj6tcFqyS/Z1UKiXzLsCN8mTP8Bbj1OQa9aK/2r7E1qu6Pt4lhvHGS/jyFEa5mSWLvxLAnDIY PPvPb/GgoLT2AILIHh0X3ZmoaDDOwcQmLVJmwuoEE9j8DKyLqbTTZx9vgcf6BIW8tn8DnhFZ2Zo4 g7U01v9JPU2xtCxK/WkCxXcawbPtD3kz8mhw/7LD47+SFvz1d4af/+jtTwAAAP//AwBQSwMEFAAG AAgAAAAhAJHUi/riAAAADgEAAA8AAABkcnMvZG93bnJldi54bWxMj09Pg0AQxe8mfofNmHizS9VC pSxNU2M4GtFEj1t2BJSdRXah6Kd3jAe9TPLmz5vfy7az7cSEg28dKVguIhBIlTMt1QqeHu8u1iB8 0GR05wgVfKKHbX56kunUuCM94FSGWrAJ+VQraELoUyl91aDVfuF6JJ69usHqwHKopRn0kc1tJy+j KJZWt8QfGt3jvsHqvRytgnksi/WHb6d7+tq/7OqkuH4rnpU6P5tvN1x2GxAB5/B3AT8ZmB9yBju4 kYwXHeskZv6g4CpegeCFm+UqAXH4bcg8k/9j5N8AAAD//wMAUEsBAi0AFAAGAAgAAAAhALaDOJL+ AAAA4QEAABMAAAAAAAAAAAAAAAAAAAAAAFtDb250ZW50X1R5cGVzXS54bWxQSwECLQAUAAYACAAA ACEAOP0h/9YAAACUAQAACwAAAAAAAAAAAAAAAAAvAQAAX3JlbHMvLnJlbHNQSwECLQAUAAYACAAA ACEAwafHTdoBAAAZBAAADgAAAAAAAAAAAAAAAAAuAgAAZHJzL2Uyb0RvYy54bWxQSwECLQAUAAYA CAAAACEAkdSL+uIAAAAOAQAADwAAAAAAAAAAAAAAAAA0BAAAZHJzL2Rvd25yZXYueG1sUEsFBgAA AAAEAAQA8wAAAEMFAAAAAA== " strokecolor="#5a5a5a [2109]" strokeweight="1.25pt">
+                <v:stroke joinstyle="miter"/>
+              </v:line>
+            </w:pict>
+          </mc:Fallback>
+        </mc:AlternateContent>
+      </w:r>
+      <w:r>
+        <w:rPr>
+          <w:rFonts w:ascii="Monoplex KR Nerd" w:hAnsi="Monoplex KR Nerd"/>
+          <w:b/>
+          <w:bCs/>
+          <w:color w:val="86B37F"/>
+          <w:sz w:val="36"/>
+          <w:szCs w:val="40"/>
+        </w:rPr>
+        <w:t>R</w:t>
+      </w:r>
+      <w:r>
+        <w:rPr>
+          <w:rFonts w:ascii="Monoplex KR Nerd" w:hAnsi="Monoplex KR Nerd"/>
+          <w:b/>
+          <w:bCs/>
+          <w:sz w:val="36"/>
+          <w:szCs w:val="40"/>
+        </w:rPr>
+        <w:t xml:space="preserve">esearch </w:t>
+      </w:r>
+      <w:r>
+        <w:rPr>
+          <w:rFonts w:ascii="Monoplex KR Nerd" w:hAnsi="Monoplex KR Nerd"/>
+          <w:b/>
+          <w:bCs/>
+          <w:color w:val="86B37F"/>
+          <w:sz w:val="36"/>
+          <w:szCs w:val="40"/>
+        </w:rPr>
+        <w:t>E</w:t>
+      </w:r>
+      <w:r>
+        <w:rPr>
+          <w:rFonts w:ascii="Monoplex KR Nerd" w:hAnsi="Monoplex KR Nerd"/>
+          <w:b/>
+          <w:bCs/>
+          <w:sz w:val="36"/>
+          <w:szCs w:val="40"/>
+        </w:rPr>
+        <w:t>xperience</w:t>
+      </w:r>
+    </w:p>
+    <w:p>
+      <w:pPr>
+        <w:rPr>
+          <w:b/>
+          <w:bCs/>
+        </w:rPr>
+      </w:pPr>
+    </w:p>
+    <w:p>
+      <w:r>
+        <w:rPr>
+          <w:b/>
+          <w:bCs/>
+        </w:rPr>
+        <w:t>Undergraduate Research Assistant</w:t>
+      </w:r>
+    </w:p>
+    <w:p>
+      <w:pPr>
+        <w:tabs>
+          <w:tab w:val="right" w:pos="9029"/>
+        </w:tabs>
+        <w:rPr>
+          <w:color w:val="7F7F7F" w:themeColor="text1" w:themeTint="80"/>
+        </w:rPr>
+      </w:pPr>
+      <w:r>
+        <w:rPr>
+          <w:color w:val="7F7F7F"/>
+        </w:rPr>
+        <w:t>Brain–AI Interface Lab, Baekseok University</w:t>
+      </w:r>
+      <w:r>
+        <w:tab/>
+      </w:r>
+      <w:r>
+        <w:rPr>
+          <w:i/>
+          <w:color w:val="7F7F7F"/>
+          <w:sz w:val="18"/>
+        </w:rPr>
+        <w:t>2026 – Present</w:t>
+      </w:r>
+    </w:p>
+    <w:p>
+      <w:pPr>
+        <w:tabs>
+          <w:tab w:val="right" w:pos="9029"/>
+        </w:tabs>
+        <w:ind w:firstLineChars="100" w:firstLine="211"/>
+        <w:rPr>
+          <w:color w:val="7F7F7F" w:themeColor="text1" w:themeTint="80"/>
+        </w:rPr>
+      </w:pPr>
+      <w:r>
+        <w:rPr>
+          <w:color w:val="000000" w:themeColor="text1"/>
+        </w:rPr>
+        <w:t xml:space="preserve">• </w:t>
+      </w:r>
+      <w:r>
+        <w:rPr>
+          <w:color w:val="000000" w:themeColor="text1"/>
+        </w:rPr>
+        <w:t>Currently learning the basic workflow of neural data preprocessing and research environment setup.</w:t>
+      </w:r>
+    </w:p>
+    <w:p>
+      <w:pPr>
+        <w:rPr>
+          <w:b/>
+          <w:bCs/>
+          <w:szCs w:val="20"/>
+        </w:rPr>
+      </w:pPr>
+    </w:p>
+    <w:p>
+      <w:pPr>
         <w:rPr>
           <w:rFonts w:ascii="Monoplex KR Nerd" w:hAnsi="Monoplex KR Nerd"/>
           <w:b/>
@@ -963,6 +1337,7 @@
         <w:rPr>
           <w:b/>
         </w:rPr>
+        <w:lastRenderedPageBreak/>
         <w:t>Bus Arrival Delay Prediction (sobdm-project)</w:t>
       </w:r>
     </w:p>
@@ -1049,11 +1424,23 @@
         <w:rPr>
           <w:color w:val="7F7F7F"/>
         </w:rPr>
-        <w:t>Developed a responsive, glassmorphism portfolio site from scratch in vanilla HTML, CSS, and JavaScript, with a Node.js script syncing pinned repos via the GitHub GraphQL API on a 30-minute cron job.</w:t>
-      </w:r>
-    </w:p>
-    <w:p/>
-    <w:p/>
+        <w:t xml:space="preserve">Developed a responsive, glassmorphism portfolio site from scratch in vanilla HTML, CSS, and JavaScript, with a Node.js script syncing pinned repos via the GitHub GraphQL API on a 30-minute </w:t>
+      </w:r>
+      <w:proofErr w:type="spellStart"/>
+      <w:r>
+        <w:rPr>
+          <w:color w:val="7F7F7F"/>
+        </w:rPr>
+        <w:t>cron</w:t>
+      </w:r>
+      <w:proofErr w:type="spellEnd"/>
+      <w:r>
+        <w:rPr>
+          <w:color w:val="7F7F7F"/>
+        </w:rPr>
+        <w:t xml:space="preserve"> job.</w:t>
+      </w:r>
+    </w:p>
     <w:p/>
     <w:p>
       <w:pPr>
@@ -1233,7 +1620,14 @@
         <w:rPr>
           <w:color w:val="7F7F7F" w:themeColor="text1" w:themeTint="80"/>
         </w:rPr>
-        <w:t xml:space="preserve">Fall 2023  </w:t>
+        <w:t xml:space="preserve">Fall </w:t>
+      </w:r>
+      <w:proofErr w:type="gramStart"/>
+      <w:r>
+        <w:rPr>
+          <w:color w:val="7F7F7F" w:themeColor="text1" w:themeTint="80"/>
+        </w:rPr>
+        <w:t xml:space="preserve">2023  </w:t>
       </w:r>
       <w:r>
         <w:rPr>
@@ -1241,7 +1635,16 @@
           <w:bCs/>
           <w:color w:val="000000" w:themeColor="text1"/>
         </w:rPr>
-        <w:t xml:space="preserve">Excellence Award, </w:t>
+        <w:t>Excellence</w:t>
+      </w:r>
+      <w:proofErr w:type="gramEnd"/>
+      <w:r>
+        <w:rPr>
+          <w:b/>
+          <w:bCs/>
+          <w:color w:val="000000" w:themeColor="text1"/>
+        </w:rPr>
+        <w:t xml:space="preserve"> Award, </w:t>
       </w:r>
       <w:r>
         <w:rPr>
@@ -1251,7 +1654,16 @@
       </w:r>
       <w:r>
         <w:tab/>
-        <w:t xml:space="preserve">   </w:t>
+        <w:t xml:space="preserve"> </w:t>
+      </w:r>
+      <w:r>
+        <w:rPr>
+          <w:rFonts w:hint="eastAsia"/>
+        </w:rPr>
+        <w:t xml:space="preserve"> </w:t>
+      </w:r>
+      <w:r>
+        <w:t xml:space="preserve">  </w:t>
       </w:r>
       <w:bookmarkStart w:id="0" w:name="_Hlk213250655"/>
       <w:r>
@@ -1266,6 +1678,18 @@
         <w:t>Baekseok Univ.</w:t>
       </w:r>
       <w:bookmarkEnd w:id="0"/>
+    </w:p>
+    <w:p>
+      <w:pPr>
+        <w:rPr>
+          <w:rFonts w:ascii="Monoplex KR Nerd" w:hAnsi="Monoplex KR Nerd"/>
+          <w:b/>
+          <w:bCs/>
+          <w:color w:val="595959" w:themeColor="text1" w:themeTint="A6"/>
+          <w:sz w:val="24"/>
+          <w:szCs w:val="28"/>
+        </w:rPr>
+      </w:pPr>
     </w:p>
     <w:p>
       <w:pPr>
@@ -1332,29 +1756,14 @@
         <w:rPr>
           <w:color w:val="7F7F7F"/>
         </w:rPr>
-        <w:t xml:space="preserve">Fall </w:t>
-      </w:r>
-      <w:proofErr w:type="gramStart"/>
-      <w:r>
-        <w:rPr>
+        <w:t xml:space="preserve">Fall 2025  </w:t>
+      </w:r>
+      <w:r>
+        <w:rPr>
+          <w:b/>
           <w:color w:val="7F7F7F"/>
         </w:rPr>
-        <w:t xml:space="preserve">2025  </w:t>
-      </w:r>
-      <w:r>
-        <w:rPr>
-          <w:b/>
-          <w:color w:val="7F7F7F"/>
-        </w:rPr>
-        <w:t>Faculty</w:t>
-      </w:r>
-      <w:proofErr w:type="gramEnd"/>
-      <w:r>
-        <w:rPr>
-          <w:b/>
-          <w:color w:val="7F7F7F"/>
-        </w:rPr>
-        <w:t xml:space="preserve"> Recommendation Scholarship </w:t>
+        <w:t xml:space="preserve">Faculty Recommendation Scholarship </w:t>
       </w:r>
       <w:r>
         <w:tab/>
@@ -1830,7 +2239,15 @@
           <w:color w:val="7F7F7F" w:themeColor="text1" w:themeTint="80"/>
           <w:szCs w:val="20"/>
         </w:rPr>
-        <w:t xml:space="preserve">Python, </w:t>
+        <w:t>Python, C++, Rust, Go</w:t>
+      </w:r>
+      <w:r>
+        <w:rPr>
+          <w:rFonts w:cs="Times New Roman" w:hint="eastAsia"/>
+          <w:color w:val="7F7F7F" w:themeColor="text1" w:themeTint="80"/>
+          <w:szCs w:val="20"/>
+        </w:rPr>
+        <w:t>,</w:t>
       </w:r>
       <w:r>
         <w:rPr>
@@ -1838,7 +2255,77 @@
           <w:color w:val="7F7F7F" w:themeColor="text1" w:themeTint="80"/>
           <w:szCs w:val="20"/>
         </w:rPr>
-        <w:t>C++, Rust, Go</w:t>
+        <w:t xml:space="preserve"> </w:t>
+      </w:r>
+      <w:r>
+        <w:rPr>
+          <w:rFonts w:cs="Times New Roman"/>
+          <w:color w:val="7F7F7F" w:themeColor="text1" w:themeTint="80"/>
+          <w:szCs w:val="20"/>
+        </w:rPr>
+        <w:t>N</w:t>
+      </w:r>
+      <w:r>
+        <w:rPr>
+          <w:rFonts w:cs="Times New Roman"/>
+          <w:color w:val="7F7F7F" w:themeColor="text1" w:themeTint="80"/>
+          <w:szCs w:val="20"/>
+        </w:rPr>
+        <w:t xml:space="preserve">ode.js, JavaScript, HTML/CSS </w:t>
+      </w:r>
+    </w:p>
+    <w:p>
+      <w:pPr>
+        <w:rPr>
+          <w:rFonts w:cs="Times New Roman"/>
+          <w:color w:val="7F7F7F" w:themeColor="text1" w:themeTint="80"/>
+          <w:szCs w:val="20"/>
+        </w:rPr>
+      </w:pPr>
+      <w:r>
+        <w:rPr>
+          <w:rFonts w:cs="Times New Roman"/>
+          <w:b/>
+          <w:bCs/>
+          <w:color w:val="000000" w:themeColor="text1"/>
+          <w:szCs w:val="20"/>
+        </w:rPr>
+        <w:t xml:space="preserve">Machine Learning  </w:t>
+      </w:r>
+      <w:r>
+        <w:rPr>
+          <w:rFonts w:cs="Times New Roman"/>
+          <w:color w:val="7F7F7F" w:themeColor="text1" w:themeTint="80"/>
+          <w:szCs w:val="20"/>
+        </w:rPr>
+        <w:t>Scikit-learn</w:t>
+      </w:r>
+    </w:p>
+    <w:p>
+      <w:pPr>
+        <w:rPr>
+          <w:rFonts w:cs="Times New Roman"/>
+          <w:color w:val="7F7F7F" w:themeColor="text1" w:themeTint="80"/>
+          <w:szCs w:val="20"/>
+        </w:rPr>
+      </w:pPr>
+      <w:r>
+        <w:rPr>
+          <w:rFonts w:cs="Times New Roman"/>
+          <w:b/>
+          <w:bCs/>
+          <w:color w:val="000000" w:themeColor="text1"/>
+          <w:szCs w:val="20"/>
+        </w:rPr>
+        <w:t xml:space="preserve">Deep Learning     </w:t>
+      </w:r>
+      <w:r>
+        <w:rPr>
+          <w:rFonts w:cs="Times New Roman"/>
+          <w:color w:val="7F7F7F" w:themeColor="text1" w:themeTint="80"/>
+          <w:szCs w:val="20"/>
+        </w:rPr>
+        <w:t>PyTorch</w:t>
       </w:r>
       <w:r>
         <w:rPr>
@@ -1846,7 +2333,7 @@
           <w:color w:val="7F7F7F" w:themeColor="text1" w:themeTint="80"/>
           <w:szCs w:val="20"/>
         </w:rPr>
-        <w:t>,</w:t>
+        <w:t xml:space="preserve">, </w:t>
       </w:r>
       <w:r>
         <w:rPr>
@@ -1854,7 +2341,48 @@
           <w:color w:val="7F7F7F" w:themeColor="text1" w:themeTint="80"/>
           <w:szCs w:val="20"/>
         </w:rPr>
+        <w:t>TensorFlow</w:t>
+      </w:r>
+    </w:p>
+    <w:p>
+      <w:pPr>
+        <w:rPr>
+          <w:rFonts w:cs="Times New Roman"/>
+          <w:b/>
+          <w:bCs/>
+          <w:color w:val="000000" w:themeColor="text1"/>
+          <w:szCs w:val="20"/>
+        </w:rPr>
+      </w:pPr>
+      <w:r>
+        <w:rPr>
+          <w:rFonts w:cs="Times New Roman"/>
+          <w:b/>
+          <w:bCs/>
+          <w:color w:val="000000" w:themeColor="text1"/>
+          <w:szCs w:val="20"/>
+        </w:rPr>
+        <w:t>Data Analysis</w:t>
+      </w:r>
+      <w:r>
+        <w:rPr>
+          <w:rFonts w:cs="Times New Roman" w:hint="eastAsia"/>
+          <w:b/>
+          <w:bCs/>
+          <w:color w:val="000000" w:themeColor="text1"/>
+          <w:szCs w:val="20"/>
+        </w:rPr>
         <w:t xml:space="preserve"> </w:t>
+      </w:r>
+      <w:r>
+        <w:rPr>
+          <w:rFonts w:cs="Times New Roman"/>
+          <w:b/>
+          <w:bCs/>
+          <w:color w:val="000000" w:themeColor="text1"/>
+          <w:szCs w:val="20"/>
+        </w:rPr>
+        <w:t xml:space="preserve">     </w:t>
       </w:r>
       <w:r>
         <w:rPr>
@@ -1862,7 +2390,7 @@
           <w:color w:val="7F7F7F" w:themeColor="text1" w:themeTint="80"/>
           <w:szCs w:val="20"/>
         </w:rPr>
-        <w:t xml:space="preserve">node.js, </w:t>
+        <w:t xml:space="preserve">NumPy, </w:t>
       </w:r>
       <w:r>
         <w:rPr>
@@ -1870,7 +2398,7 @@
           <w:color w:val="7F7F7F" w:themeColor="text1" w:themeTint="80"/>
           <w:szCs w:val="20"/>
         </w:rPr>
-        <w:t>JavaScript, HTML/CSS</w:t>
+        <w:t>p</w:t>
       </w:r>
       <w:r>
         <w:rPr>
@@ -1878,172 +2406,7 @@
           <w:color w:val="7F7F7F" w:themeColor="text1" w:themeTint="80"/>
           <w:szCs w:val="20"/>
         </w:rPr>
-        <w:t xml:space="preserve"> </w:t>
-      </w:r>
-    </w:p>
-    <w:p>
-      <w:pPr>
-        <w:rPr>
-          <w:rFonts w:cs="Times New Roman"/>
-          <w:color w:val="7F7F7F" w:themeColor="text1" w:themeTint="80"/>
-          <w:szCs w:val="20"/>
-        </w:rPr>
-      </w:pPr>
-      <w:r>
-        <w:rPr>
-          <w:rFonts w:cs="Times New Roman"/>
-          <w:b/>
-          <w:bCs/>
-          <w:color w:val="000000" w:themeColor="text1"/>
-          <w:szCs w:val="20"/>
-        </w:rPr>
-        <w:t xml:space="preserve">Machine </w:t>
-      </w:r>
-      <w:proofErr w:type="gramStart"/>
-      <w:r>
-        <w:rPr>
-          <w:rFonts w:cs="Times New Roman"/>
-          <w:b/>
-          <w:bCs/>
-          <w:color w:val="000000" w:themeColor="text1"/>
-          <w:szCs w:val="20"/>
-        </w:rPr>
-        <w:t xml:space="preserve">Learning  </w:t>
-      </w:r>
-      <w:r>
-        <w:rPr>
-          <w:rFonts w:cs="Times New Roman"/>
-          <w:color w:val="7F7F7F" w:themeColor="text1" w:themeTint="80"/>
-          <w:szCs w:val="20"/>
-        </w:rPr>
-        <w:t>Scikit</w:t>
-      </w:r>
-      <w:proofErr w:type="gramEnd"/>
-      <w:r>
-        <w:rPr>
-          <w:rFonts w:cs="Times New Roman"/>
-          <w:color w:val="7F7F7F" w:themeColor="text1" w:themeTint="80"/>
-          <w:szCs w:val="20"/>
-        </w:rPr>
-        <w:t>-learn</w:t>
-      </w:r>
-    </w:p>
-    <w:p>
-      <w:pPr>
-        <w:rPr>
-          <w:rFonts w:cs="Times New Roman" w:hint="eastAsia"/>
-          <w:color w:val="7F7F7F" w:themeColor="text1" w:themeTint="80"/>
-          <w:szCs w:val="20"/>
-        </w:rPr>
-      </w:pPr>
-      <w:r>
-        <w:rPr>
-          <w:rFonts w:cs="Times New Roman"/>
-          <w:b/>
-          <w:bCs/>
-          <w:color w:val="000000" w:themeColor="text1"/>
-          <w:szCs w:val="20"/>
-        </w:rPr>
-        <w:t xml:space="preserve">Deep Learning     </w:t>
-      </w:r>
-      <w:proofErr w:type="spellStart"/>
-      <w:r>
-        <w:rPr>
-          <w:rFonts w:cs="Times New Roman"/>
-          <w:color w:val="7F7F7F" w:themeColor="text1" w:themeTint="80"/>
-          <w:szCs w:val="20"/>
-        </w:rPr>
-        <w:t>PyTorch</w:t>
-      </w:r>
-      <w:proofErr w:type="spellEnd"/>
-      <w:r>
-        <w:rPr>
-          <w:rFonts w:cs="Times New Roman" w:hint="eastAsia"/>
-          <w:color w:val="7F7F7F" w:themeColor="text1" w:themeTint="80"/>
-          <w:szCs w:val="20"/>
-        </w:rPr>
-        <w:t xml:space="preserve">, </w:t>
-      </w:r>
-      <w:r>
-        <w:rPr>
-          <w:rFonts w:cs="Times New Roman"/>
-          <w:color w:val="7F7F7F" w:themeColor="text1" w:themeTint="80"/>
-          <w:szCs w:val="20"/>
-        </w:rPr>
-        <w:t>T</w:t>
-      </w:r>
-      <w:r>
-        <w:rPr>
-          <w:rFonts w:cs="Times New Roman"/>
-          <w:color w:val="7F7F7F" w:themeColor="text1" w:themeTint="80"/>
-          <w:szCs w:val="20"/>
-        </w:rPr>
-        <w:t>ensor</w:t>
-      </w:r>
-      <w:r>
-        <w:rPr>
-          <w:rFonts w:cs="Times New Roman"/>
-          <w:color w:val="7F7F7F" w:themeColor="text1" w:themeTint="80"/>
-          <w:szCs w:val="20"/>
-        </w:rPr>
-        <w:t>F</w:t>
-      </w:r>
-      <w:r>
-        <w:rPr>
-          <w:rFonts w:cs="Times New Roman"/>
-          <w:color w:val="7F7F7F" w:themeColor="text1" w:themeTint="80"/>
-          <w:szCs w:val="20"/>
-        </w:rPr>
-        <w:t>low</w:t>
-      </w:r>
-    </w:p>
-    <w:p>
-      <w:pPr>
-        <w:rPr>
-          <w:rFonts w:cs="Times New Roman"/>
-          <w:b/>
-          <w:bCs/>
-          <w:color w:val="000000" w:themeColor="text1"/>
-          <w:szCs w:val="20"/>
-        </w:rPr>
-      </w:pPr>
-      <w:r>
-        <w:rPr>
-          <w:rFonts w:cs="Times New Roman"/>
-          <w:b/>
-          <w:bCs/>
-          <w:color w:val="000000" w:themeColor="text1"/>
-          <w:szCs w:val="20"/>
-        </w:rPr>
-        <w:t>Data Analysis</w:t>
-      </w:r>
-      <w:r>
-        <w:rPr>
-          <w:rFonts w:cs="Times New Roman" w:hint="eastAsia"/>
-          <w:b/>
-          <w:bCs/>
-          <w:color w:val="000000" w:themeColor="text1"/>
-          <w:szCs w:val="20"/>
-        </w:rPr>
-        <w:t xml:space="preserve"> </w:t>
-      </w:r>
-      <w:r>
-        <w:rPr>
-          <w:rFonts w:cs="Times New Roman"/>
-          <w:b/>
-          <w:bCs/>
-          <w:color w:val="000000" w:themeColor="text1"/>
-          <w:szCs w:val="20"/>
-        </w:rPr>
-        <w:t xml:space="preserve">     </w:t>
-      </w:r>
-      <w:r>
-        <w:rPr>
-          <w:rFonts w:cs="Times New Roman"/>
-          <w:color w:val="7F7F7F" w:themeColor="text1" w:themeTint="80"/>
-          <w:szCs w:val="20"/>
-        </w:rPr>
-        <w:t>NumPy, Pandas, SciPy</w:t>
+        <w:t>andas, SciPy</w:t>
       </w:r>
       <w:r>
         <w:rPr>
@@ -2067,6 +2430,155 @@
 <file path=word/numbering.xml><?xml version="1.0" encoding="utf-8"?>
 <w:numbering xmlns:wpc="http://schemas.microsoft.com/office/word/2010/wordprocessingCanvas" xmlns:cx="http://schemas.microsoft.com/office/drawing/2014/chartex" xmlns:cx1="http://schemas.microsoft.com/office/drawing/2015/9/8/chartex" xmlns:cx2="http://schemas.microsoft.com/office/drawing/2015/10/21/chartex" xmlns:cx3="http://schemas.microsoft.com/office/drawing/2016/5/9/chartex" xmlns:cx4="http://schemas.microsoft.com/office/drawing/2016/5/10/chartex" xmlns:cx5="http://schemas.microsoft.com/office/drawing/2016/5/11/chartex" xmlns:cx6="http://schemas.microsoft.com/office/drawing/2016/5/12/chartex" xmlns:cx7="http://schemas.microsoft.com/office/drawing/2016/5/13/chartex" xmlns:cx8="http://schemas.microsoft.com/office/drawing/2016/5/14/chartex" xmlns:mc="http://schemas.openxmlformats.org/markup-compatibility/2006" xmlns:m="http://schemas.openxmlformats.org/officeDocument/2006/math" xmlns:aink="http://schemas.microsoft.com/office/drawing/2016/ink" xmlns:am3d="http://schemas.microsoft.com/office/drawing/2017/model3d" xmlns:oel="http://schemas.microsoft.com/office/2019/extlst" xmlns:r="http://schemas.openxmlformats.org/officeDocument/2006/relationships" xmlns:wp14="http://schemas.microsoft.com/office/word/2010/wordprocessingDrawing" xmlns:wp="http://schemas.openxmlformats.org/drawingml/2006/wordprocessingDrawing" xmlns:wpg="http://schemas.microsoft.com/office/word/2010/wordprocessingGroup" xmlns:wpi="http://schemas.microsoft.com/office/word/2010/wordprocessingInk" xmlns:wps="http://schemas.microsoft.com/office/word/2010/wordprocessingShape" xmlns:o="urn:schemas-microsoft-com:office:office" xmlns:v="urn:schemas-microsoft-com:vml" xmlns:w10="urn:schemas-microsoft-com:office:word" xmlns:w="http://schemas.openxmlformats.org/wordprocessingml/2006/main" xmlns:w14="http://schemas.microsoft.com/office/word/2010/wordml" xmlns:w15="http://schemas.microsoft.com/office/word/2012/wordml" xmlns:w16cex="http://schemas.microsoft.com/office/word/2018/wordml/cex" xmlns:w16cid="http://schemas.microsoft.com/office/word/2016/wordml/cid" xmlns:w16="http://schemas.microsoft.com/office/word/2018/wordml" xmlns:w16sdtdh="http://schemas.microsoft.com/office/word/2020/wordml/sdtdatahash" xmlns:w16sdtfl="http://schemas.microsoft.com/office/word/2024/wordml/sdtformatlock" xmlns:w16se="http://schemas.microsoft.com/office/word/2015/wordml/symex" xmlns:w16du="http://schemas.microsoft.com/office/word/2023/wordml/word16du" xmlns:wne="http://schemas.microsoft.com/office/word/2006/wordml" mc:Ignorable="w14 w15 w16se w16cid w16 w16cex w16sdtdh w16sdtfl w16du wp14">
   <w:abstractNum w:abstractNumId="0" w15:restartNumberingAfterBreak="0">
+    <w:nsid w:val="0AAB7C5A"/>
+    <w:multiLevelType w:val="multilevel"/>
+    <w:tmpl w:val="CA7EBEA2"/>
+    <w:lvl w:ilvl="0">
+      <w:start w:val="1"/>
+      <w:numFmt w:val="bullet"/>
+      <w:lvlText w:val=""/>
+      <w:lvlJc w:val="left"/>
+      <w:pPr>
+        <w:tabs>
+          <w:tab w:val="num" w:pos="720"/>
+        </w:tabs>
+        <w:ind w:left="720" w:hanging="360"/>
+      </w:pPr>
+      <w:rPr>
+        <w:rFonts w:ascii="Symbol" w:hAnsi="Symbol" w:hint="default"/>
+        <w:sz w:val="20"/>
+      </w:rPr>
+    </w:lvl>
+    <w:lvl w:ilvl="1" w:tentative="1">
+      <w:start w:val="1"/>
+      <w:numFmt w:val="bullet"/>
+      <w:lvlText w:val="o"/>
+      <w:lvlJc w:val="left"/>
+      <w:pPr>
+        <w:tabs>
+          <w:tab w:val="num" w:pos="1440"/>
+        </w:tabs>
+        <w:ind w:left="1440" w:hanging="360"/>
+      </w:pPr>
+      <w:rPr>
+        <w:rFonts w:ascii="Courier New" w:hAnsi="Courier New" w:hint="default"/>
+        <w:sz w:val="20"/>
+      </w:rPr>
+    </w:lvl>
+    <w:lvl w:ilvl="2" w:tentative="1">
+      <w:start w:val="1"/>
+      <w:numFmt w:val="bullet"/>
+      <w:lvlText w:val=""/>
+      <w:lvlJc w:val="left"/>
+      <w:pPr>
+        <w:tabs>
+          <w:tab w:val="num" w:pos="2160"/>
+        </w:tabs>
+        <w:ind w:left="2160" w:hanging="360"/>
+      </w:pPr>
+      <w:rPr>
+        <w:rFonts w:ascii="Wingdings" w:hAnsi="Wingdings" w:hint="default"/>
+        <w:sz w:val="20"/>
+      </w:rPr>
+    </w:lvl>
+    <w:lvl w:ilvl="3" w:tentative="1">
+      <w:start w:val="1"/>
+      <w:numFmt w:val="bullet"/>
+      <w:lvlText w:val=""/>
+      <w:lvlJc w:val="left"/>
+      <w:pPr>
+        <w:tabs>
+          <w:tab w:val="num" w:pos="2880"/>
+        </w:tabs>
+        <w:ind w:left="2880" w:hanging="360"/>
+      </w:pPr>
+      <w:rPr>
+        <w:rFonts w:ascii="Wingdings" w:hAnsi="Wingdings" w:hint="default"/>
+        <w:sz w:val="20"/>
+      </w:rPr>
+    </w:lvl>
+    <w:lvl w:ilvl="4" w:tentative="1">
+      <w:start w:val="1"/>
+      <w:numFmt w:val="bullet"/>
+      <w:lvlText w:val=""/>
+      <w:lvlJc w:val="left"/>
+      <w:pPr>
+        <w:tabs>
+          <w:tab w:val="num" w:pos="3600"/>
+        </w:tabs>
+        <w:ind w:left="3600" w:hanging="360"/>
+      </w:pPr>
+      <w:rPr>
+        <w:rFonts w:ascii="Wingdings" w:hAnsi="Wingdings" w:hint="default"/>
+        <w:sz w:val="20"/>
+      </w:rPr>
+    </w:lvl>
+    <w:lvl w:ilvl="5" w:tentative="1">
+      <w:start w:val="1"/>
+      <w:numFmt w:val="bullet"/>
+      <w:lvlText w:val=""/>
+      <w:lvlJc w:val="left"/>
+      <w:pPr>
+        <w:tabs>
+          <w:tab w:val="num" w:pos="4320"/>
+        </w:tabs>
+        <w:ind w:left="4320" w:hanging="360"/>
+      </w:pPr>
+      <w:rPr>
+        <w:rFonts w:ascii="Wingdings" w:hAnsi="Wingdings" w:hint="default"/>
+        <w:sz w:val="20"/>
+      </w:rPr>
+    </w:lvl>
+    <w:lvl w:ilvl="6" w:tentative="1">
+      <w:start w:val="1"/>
+      <w:numFmt w:val="bullet"/>
+      <w:lvlText w:val=""/>
+      <w:lvlJc w:val="left"/>
+      <w:pPr>
+        <w:tabs>
+          <w:tab w:val="num" w:pos="5040"/>
+        </w:tabs>
+        <w:ind w:left="5040" w:hanging="360"/>
+      </w:pPr>
+      <w:rPr>
+        <w:rFonts w:ascii="Wingdings" w:hAnsi="Wingdings" w:hint="default"/>
+        <w:sz w:val="20"/>
+      </w:rPr>
+    </w:lvl>
+    <w:lvl w:ilvl="7" w:tentative="1">
+      <w:start w:val="1"/>
+      <w:numFmt w:val="bullet"/>
+      <w:lvlText w:val=""/>
+      <w:lvlJc w:val="left"/>
+      <w:pPr>
+        <w:tabs>
+          <w:tab w:val="num" w:pos="5760"/>
+        </w:tabs>
+        <w:ind w:left="5760" w:hanging="360"/>
+      </w:pPr>
+      <w:rPr>
+        <w:rFonts w:ascii="Wingdings" w:hAnsi="Wingdings" w:hint="default"/>
+        <w:sz w:val="20"/>
+      </w:rPr>
+    </w:lvl>
+    <w:lvl w:ilvl="8" w:tentative="1">
+      <w:start w:val="1"/>
+      <w:numFmt w:val="bullet"/>
+      <w:lvlText w:val=""/>
+      <w:lvlJc w:val="left"/>
+      <w:pPr>
+        <w:tabs>
+          <w:tab w:val="num" w:pos="6480"/>
+        </w:tabs>
+        <w:ind w:left="6480" w:hanging="360"/>
+      </w:pPr>
+      <w:rPr>
+        <w:rFonts w:ascii="Wingdings" w:hAnsi="Wingdings" w:hint="default"/>
+        <w:sz w:val="20"/>
+      </w:rPr>
+    </w:lvl>
+  </w:abstractNum>
+  <w:abstractNum w:abstractNumId="1" w15:restartNumberingAfterBreak="0">
     <w:nsid w:val="2CCF3DE4"/>
     <w:multiLevelType w:val="hybridMultilevel"/>
     <w:tmpl w:val="9D9C0E84"/>
@@ -2179,7 +2691,7 @@
       </w:rPr>
     </w:lvl>
   </w:abstractNum>
-  <w:abstractNum w:abstractNumId="1" w15:restartNumberingAfterBreak="0">
+  <w:abstractNum w:abstractNumId="2" w15:restartNumberingAfterBreak="0">
     <w:nsid w:val="4AC122DE"/>
     <w:multiLevelType w:val="hybridMultilevel"/>
     <w:tmpl w:val="F064D26A"/>
@@ -2292,7 +2804,7 @@
       </w:rPr>
     </w:lvl>
   </w:abstractNum>
-  <w:abstractNum w:abstractNumId="2" w15:restartNumberingAfterBreak="0">
+  <w:abstractNum w:abstractNumId="3" w15:restartNumberingAfterBreak="0">
     <w:nsid w:val="4B415313"/>
     <w:multiLevelType w:val="multilevel"/>
     <w:tmpl w:val="8BD6137E"/>
@@ -2441,7 +2953,7 @@
       </w:rPr>
     </w:lvl>
   </w:abstractNum>
-  <w:abstractNum w:abstractNumId="3" w15:restartNumberingAfterBreak="0">
+  <w:abstractNum w:abstractNumId="4" w15:restartNumberingAfterBreak="0">
     <w:nsid w:val="65B93873"/>
     <w:multiLevelType w:val="hybridMultilevel"/>
     <w:tmpl w:val="AC1C2706"/>
@@ -2554,7 +3066,7 @@
       </w:rPr>
     </w:lvl>
   </w:abstractNum>
-  <w:abstractNum w:abstractNumId="4" w15:restartNumberingAfterBreak="0">
+  <w:abstractNum w:abstractNumId="5" w15:restartNumberingAfterBreak="0">
     <w:nsid w:val="660B0F76"/>
     <w:multiLevelType w:val="hybridMultilevel"/>
     <w:tmpl w:val="718C8F54"/>
@@ -2667,7 +3179,7 @@
       </w:rPr>
     </w:lvl>
   </w:abstractNum>
-  <w:abstractNum w:abstractNumId="5" w15:restartNumberingAfterBreak="0">
+  <w:abstractNum w:abstractNumId="6" w15:restartNumberingAfterBreak="0">
     <w:nsid w:val="738D2F27"/>
     <w:multiLevelType w:val="hybridMultilevel"/>
     <w:tmpl w:val="869EC450"/>
@@ -2780,23 +3292,142 @@
       </w:rPr>
     </w:lvl>
   </w:abstractNum>
+  <w:abstractNum w:abstractNumId="7" w15:restartNumberingAfterBreak="0">
+    <w:nsid w:val="79B86501"/>
+    <w:multiLevelType w:val="multilevel"/>
+    <w:tmpl w:val="60BA2BD4"/>
+    <w:lvl w:ilvl="0">
+      <w:start w:val="4"/>
+      <w:numFmt w:val="decimal"/>
+      <w:lvlText w:val="%1."/>
+      <w:lvlJc w:val="left"/>
+      <w:pPr>
+        <w:tabs>
+          <w:tab w:val="num" w:pos="720"/>
+        </w:tabs>
+        <w:ind w:left="720" w:hanging="360"/>
+      </w:pPr>
+    </w:lvl>
+    <w:lvl w:ilvl="1" w:tentative="1">
+      <w:start w:val="1"/>
+      <w:numFmt w:val="decimal"/>
+      <w:lvlText w:val="%2."/>
+      <w:lvlJc w:val="left"/>
+      <w:pPr>
+        <w:tabs>
+          <w:tab w:val="num" w:pos="1440"/>
+        </w:tabs>
+        <w:ind w:left="1440" w:hanging="360"/>
+      </w:pPr>
+    </w:lvl>
+    <w:lvl w:ilvl="2" w:tentative="1">
+      <w:start w:val="1"/>
+      <w:numFmt w:val="decimal"/>
+      <w:lvlText w:val="%3."/>
+      <w:lvlJc w:val="left"/>
+      <w:pPr>
+        <w:tabs>
+          <w:tab w:val="num" w:pos="2160"/>
+        </w:tabs>
+        <w:ind w:left="2160" w:hanging="360"/>
+      </w:pPr>
+    </w:lvl>
+    <w:lvl w:ilvl="3" w:tentative="1">
+      <w:start w:val="1"/>
+      <w:numFmt w:val="decimal"/>
+      <w:lvlText w:val="%4."/>
+      <w:lvlJc w:val="left"/>
+      <w:pPr>
+        <w:tabs>
+          <w:tab w:val="num" w:pos="2880"/>
+        </w:tabs>
+        <w:ind w:left="2880" w:hanging="360"/>
+      </w:pPr>
+    </w:lvl>
+    <w:lvl w:ilvl="4" w:tentative="1">
+      <w:start w:val="1"/>
+      <w:numFmt w:val="decimal"/>
+      <w:lvlText w:val="%5."/>
+      <w:lvlJc w:val="left"/>
+      <w:pPr>
+        <w:tabs>
+          <w:tab w:val="num" w:pos="3600"/>
+        </w:tabs>
+        <w:ind w:left="3600" w:hanging="360"/>
+      </w:pPr>
+    </w:lvl>
+    <w:lvl w:ilvl="5" w:tentative="1">
+      <w:start w:val="1"/>
+      <w:numFmt w:val="decimal"/>
+      <w:lvlText w:val="%6."/>
+      <w:lvlJc w:val="left"/>
+      <w:pPr>
+        <w:tabs>
+          <w:tab w:val="num" w:pos="4320"/>
+        </w:tabs>
+        <w:ind w:left="4320" w:hanging="360"/>
+      </w:pPr>
+    </w:lvl>
+    <w:lvl w:ilvl="6" w:tentative="1">
+      <w:start w:val="1"/>
+      <w:numFmt w:val="decimal"/>
+      <w:lvlText w:val="%7."/>
+      <w:lvlJc w:val="left"/>
+      <w:pPr>
+        <w:tabs>
+          <w:tab w:val="num" w:pos="5040"/>
+        </w:tabs>
+        <w:ind w:left="5040" w:hanging="360"/>
+      </w:pPr>
+    </w:lvl>
+    <w:lvl w:ilvl="7" w:tentative="1">
+      <w:start w:val="1"/>
+      <w:numFmt w:val="decimal"/>
+      <w:lvlText w:val="%8."/>
+      <w:lvlJc w:val="left"/>
+      <w:pPr>
+        <w:tabs>
+          <w:tab w:val="num" w:pos="5760"/>
+        </w:tabs>
+        <w:ind w:left="5760" w:hanging="360"/>
+      </w:pPr>
+    </w:lvl>
+    <w:lvl w:ilvl="8" w:tentative="1">
+      <w:start w:val="1"/>
+      <w:numFmt w:val="decimal"/>
+      <w:lvlText w:val="%9."/>
+      <w:lvlJc w:val="left"/>
+      <w:pPr>
+        <w:tabs>
+          <w:tab w:val="num" w:pos="6480"/>
+        </w:tabs>
+        <w:ind w:left="6480" w:hanging="360"/>
+      </w:pPr>
+    </w:lvl>
+  </w:abstractNum>
   <w:num w:numId="1" w16cid:durableId="604195947">
+    <w:abstractNumId w:val="3"/>
+  </w:num>
+  <w:num w:numId="2" w16cid:durableId="2052610640">
+    <w:abstractNumId w:val="1"/>
+  </w:num>
+  <w:num w:numId="3" w16cid:durableId="1322931269">
+    <w:abstractNumId w:val="5"/>
+  </w:num>
+  <w:num w:numId="4" w16cid:durableId="1224293010">
     <w:abstractNumId w:val="2"/>
   </w:num>
-  <w:num w:numId="2" w16cid:durableId="2052610640">
+  <w:num w:numId="5" w16cid:durableId="1418017712">
+    <w:abstractNumId w:val="6"/>
+  </w:num>
+  <w:num w:numId="6" w16cid:durableId="921836842">
+    <w:abstractNumId w:val="4"/>
+  </w:num>
+  <w:num w:numId="7" w16cid:durableId="1630627715">
     <w:abstractNumId w:val="0"/>
   </w:num>
-  <w:num w:numId="3" w16cid:durableId="1322931269">
-    <w:abstractNumId w:val="4"/>
-  </w:num>
-  <w:num w:numId="4" w16cid:durableId="1224293010">
-    <w:abstractNumId w:val="1"/>
-  </w:num>
-  <w:num w:numId="5" w16cid:durableId="1418017712">
-    <w:abstractNumId w:val="5"/>
-  </w:num>
-  <w:num w:numId="6" w16cid:durableId="921836842">
-    <w:abstractNumId w:val="3"/>
+  <w:num w:numId="8" w16cid:durableId="1669136989">
+    <w:abstractNumId w:val="7"/>
   </w:num>
 </w:numbering>
 </file>
@@ -3408,7 +4039,6 @@
   <w:style w:type="character" w:default="1" w:styleId="a0">
     <w:name w:val="Default Paragraph Font"/>
     <w:uiPriority w:val="1"/>
-    <w:semiHidden/>
     <w:unhideWhenUsed/>
   </w:style>
   <w:style w:type="table" w:default="1" w:styleId="a1">

</xml_diff>